<commit_message>
feat: rebuild C1382 as finance Cowork masterclass
</commit_message>
<xml_diff>
--- a/courseware/LP-Claude Cowork Masterclass.docx
+++ b/courseware/LP-Claude Cowork Masterclass.docx
@@ -2,482 +2,17 @@
 <file path=word/document.xml><?xml version="1.0" encoding="utf-8"?>
 <w:document xmlns:wpc="http://schemas.microsoft.com/office/word/2010/wordprocessingCanvas" xmlns:mo="http://schemas.microsoft.com/office/mac/office/2008/main" xmlns:mc="http://schemas.openxmlformats.org/markup-compatibility/2006" xmlns:mv="urn:schemas-microsoft-com:mac:vml" xmlns:o="urn:schemas-microsoft-com:office:office" xmlns:r="http://schemas.openxmlformats.org/officeDocument/2006/relationships" xmlns:m="http://schemas.openxmlformats.org/officeDocument/2006/math" xmlns:v="urn:schemas-microsoft-com:vml" xmlns:wp14="http://schemas.microsoft.com/office/word/2010/wordprocessingDrawing" xmlns:wp="http://schemas.openxmlformats.org/drawingml/2006/wordprocessingDrawing" xmlns:w10="urn:schemas-microsoft-com:office:word" xmlns:w="http://schemas.openxmlformats.org/wordprocessingml/2006/main" xmlns:w14="http://schemas.microsoft.com/office/word/2010/wordml" xmlns:wpg="http://schemas.microsoft.com/office/word/2010/wordprocessingGroup" xmlns:wpi="http://schemas.microsoft.com/office/word/2010/wordprocessingInk" xmlns:wne="http://schemas.microsoft.com/office/word/2006/wordml" xmlns:wps="http://schemas.microsoft.com/office/word/2010/wordprocessingShape" mc:Ignorable="w14 wp14">
   <w:body>
-    <w:p/>
     <w:p>
       <w:pPr>
-        <w:jc w:val="center"/>
+        <w:pStyle w:val="Title"/>
       </w:pPr>
       <w:r>
-        <w:drawing>
-          <wp:inline xmlns:a="http://schemas.openxmlformats.org/drawingml/2006/main" xmlns:pic="http://schemas.openxmlformats.org/drawingml/2006/picture">
-            <wp:extent cx="1920240" cy="1920240"/>
-            <wp:docPr id="1" name="Picture 1"/>
-            <wp:cNvGraphicFramePr>
-              <a:graphicFrameLocks noChangeAspect="1"/>
-            </wp:cNvGraphicFramePr>
-            <a:graphic>
-              <a:graphicData uri="http://schemas.openxmlformats.org/drawingml/2006/picture">
-                <pic:pic>
-                  <pic:nvPicPr>
-                    <pic:cNvPr id="0" name="tertiary-infotech-logo.png"/>
-                    <pic:cNvPicPr/>
-                  </pic:nvPicPr>
-                  <pic:blipFill>
-                    <a:blip r:embed="rId9"/>
-                    <a:stretch>
-                      <a:fillRect/>
-                    </a:stretch>
-                  </pic:blipFill>
-                  <pic:spPr>
-                    <a:xfrm>
-                      <a:off x="0" y="0"/>
-                      <a:ext cx="1920240" cy="1920240"/>
-                    </a:xfrm>
-                    <a:prstGeom prst="rect"/>
-                  </pic:spPr>
-                </pic:pic>
-              </a:graphicData>
-            </a:graphic>
-          </wp:inline>
-        </w:drawing>
-      </w:r>
-    </w:p>
-    <w:p>
-      <w:pPr>
-        <w:spacing w:before="40" w:after="20"/>
-        <w:jc w:val="center"/>
-      </w:pPr>
-      <w:r>
-        <w:rPr>
-          <w:b/>
-          <w:color w:val="111827"/>
-          <w:sz w:val="26"/>
-        </w:rPr>
-        <w:t>Tertiary Infotech Academy Pte Ltd</w:t>
-      </w:r>
-    </w:p>
-    <w:p>
-      <w:pPr>
-        <w:spacing w:before="0" w:after="200"/>
-        <w:jc w:val="center"/>
-      </w:pPr>
-      <w:r>
-        <w:rPr>
-          <w:b w:val="0"/>
-          <w:color w:val="555B66"/>
-          <w:sz w:val="20"/>
-        </w:rPr>
-        <w:t>UEN: 201200696W</w:t>
-      </w:r>
-    </w:p>
-    <w:p>
-      <w:pPr>
-        <w:spacing w:before="0" w:after="80"/>
-        <w:jc w:val="center"/>
-      </w:pPr>
-      <w:r>
-        <w:rPr>
-          <w:b/>
-          <w:color w:val="1F6FEB"/>
-          <w:sz w:val="52"/>
-        </w:rPr>
-        <w:t>LESSON PLAN</w:t>
-      </w:r>
-    </w:p>
-    <w:p>
-      <w:pPr>
-        <w:spacing w:before="80" w:after="160"/>
-        <w:jc w:val="center"/>
-      </w:pPr>
-      <w:r>
-        <w:rPr>
-          <w:b w:val="0"/>
-          <w:color w:val="555B66"/>
-          <w:sz w:val="24"/>
-        </w:rPr>
-        <w:t>For</w:t>
-      </w:r>
-    </w:p>
-    <w:p>
-      <w:pPr>
-        <w:spacing w:before="80" w:after="40"/>
-        <w:jc w:val="center"/>
-      </w:pPr>
-      <w:r>
-        <w:rPr>
-          <w:b/>
-          <w:color w:val="111827"/>
-          <w:sz w:val="40"/>
-        </w:rPr>
-        <w:t>Claude Cowork Masterclass</w:t>
-      </w:r>
-    </w:p>
-    <w:p>
-      <w:pPr>
-        <w:spacing w:before="80" w:after="280"/>
-        <w:jc w:val="center"/>
-      </w:pPr>
-      <w:r>
-        <w:rPr>
-          <w:b w:val="0"/>
-          <w:color w:val="111827"/>
-          <w:sz w:val="24"/>
-        </w:rPr>
-        <w:t>Course Code: C1382</w:t>
-      </w:r>
-    </w:p>
-    <w:p>
-      <w:pPr>
-        <w:spacing w:before="0" w:after="40"/>
-        <w:jc w:val="center"/>
-      </w:pPr>
-      <w:r>
-        <w:rPr>
-          <w:b w:val="0"/>
-          <w:color w:val="555B66"/>
-          <w:sz w:val="22"/>
-        </w:rPr>
-        <w:t>Conducted by</w:t>
-      </w:r>
-    </w:p>
-    <w:p>
-      <w:pPr>
-        <w:spacing w:before="0" w:after="40"/>
-        <w:jc w:val="center"/>
-      </w:pPr>
-      <w:r>
-        <w:rPr>
-          <w:b/>
-          <w:color w:val="111827"/>
-          <w:sz w:val="26"/>
-        </w:rPr>
-        <w:t>Tertiary Infotech Academy Pte Ltd</w:t>
-      </w:r>
-    </w:p>
-    <w:p>
-      <w:pPr>
-        <w:spacing w:before="0" w:after="240"/>
-        <w:jc w:val="center"/>
-      </w:pPr>
-      <w:r>
-        <w:rPr>
-          <w:b w:val="0"/>
-          <w:color w:val="555B66"/>
-          <w:sz w:val="22"/>
-        </w:rPr>
-        <w:t>UEN: 201200696W</w:t>
-      </w:r>
-    </w:p>
-    <w:p>
-      <w:pPr>
-        <w:spacing w:before="0" w:after="80"/>
-        <w:jc w:val="center"/>
-      </w:pPr>
-      <w:r>
-        <w:rPr>
-          <w:b/>
-          <w:color w:val="1F6FEB"/>
-          <w:sz w:val="24"/>
-        </w:rPr>
-        <w:t>Version 1.0</w:t>
+        <w:t>Lesson Plan — Claude Cowork Masterclass (C1382)</w:t>
       </w:r>
     </w:p>
     <w:p>
       <w:r>
-        <w:br w:type="page"/>
-      </w:r>
-    </w:p>
-    <w:p>
-      <w:pPr>
-        <w:spacing w:after="120"/>
-      </w:pPr>
-      <w:r>
-        <w:rPr>
-          <w:b/>
-          <w:color w:val="111827"/>
-          <w:sz w:val="24"/>
-        </w:rPr>
-        <w:t>DOCUMENT VERSION CONTROL RECORD</w:t>
-      </w:r>
-    </w:p>
-    <w:tbl>
-      <w:tblPr>
-        <w:tblStyle w:val="TableGrid"/>
-        <w:tblW w:type="auto" w:w="0"/>
-        <w:jc w:val="center"/>
-        <w:tblLook w:firstColumn="1" w:firstRow="1" w:lastColumn="0" w:lastRow="0" w:noHBand="0" w:noVBand="1" w:val="04A0"/>
-      </w:tblPr>
-      <w:tblGrid>
-        <w:gridCol w:w="2160"/>
-        <w:gridCol w:w="2160"/>
-        <w:gridCol w:w="2160"/>
-        <w:gridCol w:w="2160"/>
-      </w:tblGrid>
-      <w:tr>
-        <w:tc>
-          <w:tcPr>
-            <w:tcW w:type="dxa" w:w="2160"/>
-            <w:shd w:val="clear" w:color="auto" w:fill="1F6FEB"/>
-          </w:tcPr>
-          <w:p>
-            <w:r/>
-            <w:r>
-              <w:rPr>
-                <w:b/>
-                <w:color w:val="FFFFFF"/>
-                <w:sz w:val="19"/>
-              </w:rPr>
-              <w:t>Version Number</w:t>
-            </w:r>
-          </w:p>
-        </w:tc>
-        <w:tc>
-          <w:tcPr>
-            <w:tcW w:type="dxa" w:w="2160"/>
-            <w:shd w:val="clear" w:color="auto" w:fill="1F6FEB"/>
-          </w:tcPr>
-          <w:p>
-            <w:r/>
-            <w:r>
-              <w:rPr>
-                <w:b/>
-                <w:color w:val="FFFFFF"/>
-                <w:sz w:val="19"/>
-              </w:rPr>
-              <w:t>Effective Date of Release</w:t>
-            </w:r>
-          </w:p>
-        </w:tc>
-        <w:tc>
-          <w:tcPr>
-            <w:tcW w:type="dxa" w:w="2160"/>
-            <w:shd w:val="clear" w:color="auto" w:fill="1F6FEB"/>
-          </w:tcPr>
-          <w:p>
-            <w:r/>
-            <w:r>
-              <w:rPr>
-                <w:b/>
-                <w:color w:val="FFFFFF"/>
-                <w:sz w:val="19"/>
-              </w:rPr>
-              <w:t>Summary of Included Changes</w:t>
-            </w:r>
-          </w:p>
-        </w:tc>
-        <w:tc>
-          <w:tcPr>
-            <w:tcW w:type="dxa" w:w="2160"/>
-            <w:shd w:val="clear" w:color="auto" w:fill="1F6FEB"/>
-          </w:tcPr>
-          <w:p>
-            <w:r/>
-            <w:r>
-              <w:rPr>
-                <w:b/>
-                <w:color w:val="FFFFFF"/>
-                <w:sz w:val="19"/>
-              </w:rPr>
-              <w:t>Author</w:t>
-            </w:r>
-          </w:p>
-        </w:tc>
-      </w:tr>
-      <w:tr>
-        <w:tc>
-          <w:tcPr>
-            <w:tcW w:type="dxa" w:w="2160"/>
-          </w:tcPr>
-          <w:p>
-            <w:r/>
-            <w:r>
-              <w:rPr>
-                <w:sz w:val="19"/>
-              </w:rPr>
-              <w:t>1.0</w:t>
-            </w:r>
-          </w:p>
-        </w:tc>
-        <w:tc>
-          <w:tcPr>
-            <w:tcW w:type="dxa" w:w="2160"/>
-          </w:tcPr>
-          <w:p>
-            <w:r/>
-            <w:r>
-              <w:rPr>
-                <w:sz w:val="19"/>
-              </w:rPr>
-              <w:t>3 August 2026</w:t>
-            </w:r>
-          </w:p>
-        </w:tc>
-        <w:tc>
-          <w:tcPr>
-            <w:tcW w:type="dxa" w:w="2160"/>
-          </w:tcPr>
-          <w:p>
-            <w:r/>
-            <w:r>
-              <w:rPr>
-                <w:sz w:val="19"/>
-              </w:rPr>
-              <w:t>Initial aligned release of the slide deck, Learner Guide, Lesson Plan, and three connected Northstar Operations labs.</w:t>
-            </w:r>
-          </w:p>
-        </w:tc>
-        <w:tc>
-          <w:tcPr>
-            <w:tcW w:type="dxa" w:w="2160"/>
-          </w:tcPr>
-          <w:p>
-            <w:r/>
-            <w:r>
-              <w:rPr>
-                <w:sz w:val="19"/>
-              </w:rPr>
-              <w:t>Course Trainer</w:t>
-            </w:r>
-          </w:p>
-        </w:tc>
-      </w:tr>
-    </w:tbl>
-    <w:p>
-      <w:r>
-        <w:br w:type="page"/>
-      </w:r>
-    </w:p>
-    <w:p>
-      <w:pPr>
-        <w:spacing w:after="120"/>
-      </w:pPr>
-      <w:r>
-        <w:rPr>
-          <w:b/>
-          <w:color w:val="111827"/>
-          <w:sz w:val="24"/>
-        </w:rPr>
-        <w:t>TABLE OF CONTENTS</w:t>
-      </w:r>
-    </w:p>
-    <w:p>
-      <w:pPr>
-        <w:tabs>
-          <w:tab w:pos="9072" w:val="right" w:leader="dot"/>
-        </w:tabs>
-        <w:spacing w:after="60"/>
-      </w:pPr>
-      <w:r>
-        <w:rPr>
-          <w:rFonts w:ascii="Arial" w:hAnsi="Arial"/>
-          <w:b/>
-          <w:color w:val="333333"/>
-          <w:sz w:val="22"/>
-        </w:rPr>
-        <w:t>Course Information</w:t>
-        <w:tab/>
-        <w:t>4</w:t>
-      </w:r>
-    </w:p>
-    <w:p>
-      <w:pPr>
-        <w:tabs>
-          <w:tab w:pos="9072" w:val="right" w:leader="dot"/>
-        </w:tabs>
-        <w:spacing w:after="60"/>
-      </w:pPr>
-      <w:r>
-        <w:rPr>
-          <w:rFonts w:ascii="Arial" w:hAnsi="Arial"/>
-          <w:b/>
-          <w:color w:val="333333"/>
-          <w:sz w:val="22"/>
-        </w:rPr>
-        <w:t>Learning Outcomes</w:t>
-        <w:tab/>
-        <w:t>4</w:t>
-      </w:r>
-    </w:p>
-    <w:p>
-      <w:pPr>
-        <w:tabs>
-          <w:tab w:pos="9072" w:val="right" w:leader="dot"/>
-        </w:tabs>
-        <w:spacing w:after="60"/>
-      </w:pPr>
-      <w:r>
-        <w:rPr>
-          <w:rFonts w:ascii="Arial" w:hAnsi="Arial"/>
-          <w:b/>
-          <w:color w:val="333333"/>
-          <w:sz w:val="22"/>
-        </w:rPr>
-        <w:t>Learning Reinforcement</w:t>
-        <w:tab/>
-        <w:t>4</w:t>
-      </w:r>
-    </w:p>
-    <w:p>
-      <w:pPr>
-        <w:tabs>
-          <w:tab w:pos="9072" w:val="right" w:leader="dot"/>
-        </w:tabs>
-        <w:spacing w:after="60"/>
-      </w:pPr>
-      <w:r>
-        <w:rPr>
-          <w:rFonts w:ascii="Arial" w:hAnsi="Arial"/>
-          <w:b/>
-          <w:color w:val="333333"/>
-          <w:sz w:val="22"/>
-        </w:rPr>
-        <w:t>Course Schedule</w:t>
-        <w:tab/>
-        <w:t>5</w:t>
-      </w:r>
-    </w:p>
-    <w:p>
-      <w:pPr>
-        <w:tabs>
-          <w:tab w:pos="9072" w:val="right" w:leader="dot"/>
-        </w:tabs>
-        <w:spacing w:after="60"/>
-        <w:ind w:left="432"/>
-      </w:pPr>
-      <w:r>
-        <w:rPr>
-          <w:rFonts w:ascii="Arial" w:hAnsi="Arial"/>
-          <w:b w:val="0"/>
-          <w:color w:val="333333"/>
-          <w:sz w:val="21"/>
-        </w:rPr>
-        <w:t>Day 1 — Delegate, produce, and operationalise work with Claude Cowork</w:t>
-        <w:tab/>
-        <w:t>5</w:t>
-      </w:r>
-    </w:p>
-    <w:p>
-      <w:pPr>
-        <w:tabs>
-          <w:tab w:pos="9072" w:val="right" w:leader="dot"/>
-        </w:tabs>
-        <w:spacing w:after="60"/>
-      </w:pPr>
-      <w:r>
-        <w:rPr>
-          <w:rFonts w:ascii="Arial" w:hAnsi="Arial"/>
-          <w:b/>
-          <w:color w:val="333333"/>
-          <w:sz w:val="22"/>
-        </w:rPr>
-        <w:t>Lab Reference (aligned to course topics)</w:t>
-        <w:tab/>
-        <w:t>5</w:t>
-      </w:r>
-    </w:p>
-    <w:p>
-      <w:r>
-        <w:br w:type="page"/>
+        <w:t>v2.0 · 15 September 2026 · One day · 7.5 instructional hours plus 30 minutes tea breaks and 60 minutes lunch.</w:t>
       </w:r>
     </w:p>
     <w:p>
@@ -485,1075 +20,7 @@
         <w:pStyle w:val="Heading1"/>
       </w:pPr>
       <w:r>
-        <w:t>Course Information</w:t>
-      </w:r>
-    </w:p>
-    <w:tbl>
-      <w:tblPr>
-        <w:tblStyle w:val="TableGrid"/>
-        <w:tblW w:type="auto" w:w="0"/>
-        <w:tblLook w:firstColumn="1" w:firstRow="1" w:lastColumn="0" w:lastRow="0" w:noHBand="0" w:noVBand="1" w:val="04A0"/>
-      </w:tblPr>
-      <w:tblGrid>
-        <w:gridCol w:w="4320"/>
-        <w:gridCol w:w="4320"/>
-      </w:tblGrid>
-      <w:tr>
-        <w:tc>
-          <w:tcPr>
-            <w:tcW w:type="dxa" w:w="4320"/>
-            <w:shd w:val="clear" w:color="auto" w:fill="E8F0FE"/>
-          </w:tcPr>
-          <w:p>
-            <w:r/>
-            <w:r>
-              <w:rPr>
-                <w:b/>
-                <w:sz w:val="20"/>
-              </w:rPr>
-              <w:t>Course Title</w:t>
-            </w:r>
-          </w:p>
-        </w:tc>
-        <w:tc>
-          <w:tcPr>
-            <w:tcW w:type="dxa" w:w="4320"/>
-          </w:tcPr>
-          <w:p>
-            <w:r/>
-            <w:r>
-              <w:rPr>
-                <w:sz w:val="20"/>
-              </w:rPr>
-              <w:t>Claude Cowork Masterclass</w:t>
-            </w:r>
-          </w:p>
-        </w:tc>
-      </w:tr>
-      <w:tr>
-        <w:tc>
-          <w:tcPr>
-            <w:tcW w:type="dxa" w:w="4320"/>
-            <w:shd w:val="clear" w:color="auto" w:fill="E8F0FE"/>
-          </w:tcPr>
-          <w:p>
-            <w:r/>
-            <w:r>
-              <w:rPr>
-                <w:b/>
-                <w:sz w:val="20"/>
-              </w:rPr>
-              <w:t>Course Reference</w:t>
-            </w:r>
-          </w:p>
-        </w:tc>
-        <w:tc>
-          <w:tcPr>
-            <w:tcW w:type="dxa" w:w="4320"/>
-          </w:tcPr>
-          <w:p>
-            <w:r/>
-            <w:r>
-              <w:rPr>
-                <w:sz w:val="20"/>
-              </w:rPr>
-              <w:t>C1382</w:t>
-            </w:r>
-          </w:p>
-        </w:tc>
-      </w:tr>
-      <w:tr>
-        <w:tc>
-          <w:tcPr>
-            <w:tcW w:type="dxa" w:w="4320"/>
-            <w:shd w:val="clear" w:color="auto" w:fill="E8F0FE"/>
-          </w:tcPr>
-          <w:p>
-            <w:r/>
-            <w:r>
-              <w:rPr>
-                <w:b/>
-                <w:sz w:val="20"/>
-              </w:rPr>
-              <w:t>Training Provider</w:t>
-            </w:r>
-          </w:p>
-        </w:tc>
-        <w:tc>
-          <w:tcPr>
-            <w:tcW w:type="dxa" w:w="4320"/>
-          </w:tcPr>
-          <w:p>
-            <w:r/>
-            <w:r>
-              <w:rPr>
-                <w:sz w:val="20"/>
-              </w:rPr>
-              <w:t>Tertiary Infotech Academy Pte Ltd  (UEN 201200696W)</w:t>
-            </w:r>
-          </w:p>
-        </w:tc>
-      </w:tr>
-      <w:tr>
-        <w:tc>
-          <w:tcPr>
-            <w:tcW w:type="dxa" w:w="4320"/>
-            <w:shd w:val="clear" w:color="auto" w:fill="E8F0FE"/>
-          </w:tcPr>
-          <w:p>
-            <w:r/>
-            <w:r>
-              <w:rPr>
-                <w:b/>
-                <w:sz w:val="20"/>
-              </w:rPr>
-              <w:t>Duration</w:t>
-            </w:r>
-          </w:p>
-        </w:tc>
-        <w:tc>
-          <w:tcPr>
-            <w:tcW w:type="dxa" w:w="4320"/>
-          </w:tcPr>
-          <w:p>
-            <w:r/>
-            <w:r>
-              <w:rPr>
-                <w:sz w:val="20"/>
-              </w:rPr>
-              <w:t>1 day · 7 instructional hours · 7.5 clock hours including tea breaks</w:t>
-            </w:r>
-          </w:p>
-        </w:tc>
-      </w:tr>
-      <w:tr>
-        <w:tc>
-          <w:tcPr>
-            <w:tcW w:type="dxa" w:w="4320"/>
-            <w:shd w:val="clear" w:color="auto" w:fill="E8F0FE"/>
-          </w:tcPr>
-          <w:p>
-            <w:r/>
-            <w:r>
-              <w:rPr>
-                <w:b/>
-                <w:sz w:val="20"/>
-              </w:rPr>
-              <w:t>Daily Timing</w:t>
-            </w:r>
-          </w:p>
-        </w:tc>
-        <w:tc>
-          <w:tcPr>
-            <w:tcW w:type="dxa" w:w="4320"/>
-          </w:tcPr>
-          <w:p>
-            <w:r/>
-            <w:r>
-              <w:rPr>
-                <w:sz w:val="20"/>
-              </w:rPr>
-              <w:t>9:00 am - 5:30 pm (1-hour lunch; two 15-minute tea breaks included)</w:t>
-            </w:r>
-          </w:p>
-        </w:tc>
-      </w:tr>
-      <w:tr>
-        <w:tc>
-          <w:tcPr>
-            <w:tcW w:type="dxa" w:w="4320"/>
-            <w:shd w:val="clear" w:color="auto" w:fill="E8F0FE"/>
-          </w:tcPr>
-          <w:p>
-            <w:r/>
-            <w:r>
-              <w:rPr>
-                <w:b/>
-                <w:sz w:val="20"/>
-              </w:rPr>
-              <w:t>Mode</w:t>
-            </w:r>
-          </w:p>
-        </w:tc>
-        <w:tc>
-          <w:tcPr>
-            <w:tcW w:type="dxa" w:w="4320"/>
-          </w:tcPr>
-          <w:p>
-            <w:r/>
-            <w:r>
-              <w:rPr>
-                <w:sz w:val="20"/>
-              </w:rPr>
-              <w:t>Instructor-led, concept-first learning with connected hands-on labs</w:t>
-            </w:r>
-          </w:p>
-        </w:tc>
-      </w:tr>
-      <w:tr>
-        <w:tc>
-          <w:tcPr>
-            <w:tcW w:type="dxa" w:w="4320"/>
-            <w:shd w:val="clear" w:color="auto" w:fill="E8F0FE"/>
-          </w:tcPr>
-          <w:p>
-            <w:r/>
-            <w:r>
-              <w:rPr>
-                <w:b/>
-                <w:sz w:val="20"/>
-              </w:rPr>
-              <w:t>Trainer</w:t>
-            </w:r>
-          </w:p>
-        </w:tc>
-        <w:tc>
-          <w:tcPr>
-            <w:tcW w:type="dxa" w:w="4320"/>
-          </w:tcPr>
-          <w:p>
-            <w:r/>
-            <w:r>
-              <w:rPr>
-                <w:sz w:val="20"/>
-              </w:rPr>
-              <w:t>Course Trainer</w:t>
-            </w:r>
-          </w:p>
-        </w:tc>
-      </w:tr>
-    </w:tbl>
-    <w:p>
-      <w:pPr>
-        <w:pStyle w:val="Heading1"/>
-      </w:pPr>
-      <w:r>
-        <w:t>Learning Outcomes</w:t>
-      </w:r>
-    </w:p>
-    <w:p>
-      <w:r>
-        <w:t>On completion of this course, learners will be able to:</w:t>
-      </w:r>
-    </w:p>
-    <w:p>
-      <w:pPr>
-        <w:pStyle w:val="ListBullet"/>
-      </w:pPr>
-      <w:r>
-        <w:rPr>
-          <w:sz w:val="21"/>
-        </w:rPr>
-        <w:t>LO1: Explain Claude Cowork's agentic operating model, execution surfaces, connected-folder boundary, task lifecycle, permissions, and the human responsibilities that remain.</w:t>
-      </w:r>
-    </w:p>
-    <w:p>
-      <w:pPr>
-        <w:pStyle w:val="ListBullet"/>
-      </w:pPr>
-      <w:r>
-        <w:rPr>
-          <w:sz w:val="21"/>
-        </w:rPr>
-        <w:t>LO2: Set up a Cowork project, write an outcome-based task brief, run and monitor a bounded session, review its evidence, and recover from common setup or scope problems.</w:t>
-      </w:r>
-    </w:p>
-    <w:p>
-      <w:pPr>
-        <w:pStyle w:val="ListBullet"/>
-      </w:pPr>
-      <w:r>
-        <w:rPr>
-          <w:sz w:val="21"/>
-        </w:rPr>
-        <w:t>LO3: Use Cowork to organise synthetic files, analyse spreadsheet data, synthesise research and notes, and produce consistent document, spreadsheet, and presentation outputs with traceable sources.</w:t>
-      </w:r>
-    </w:p>
-    <w:p>
-      <w:pPr>
-        <w:pStyle w:val="ListBullet"/>
-      </w:pPr>
-      <w:r>
-        <w:rPr>
-          <w:sz w:val="21"/>
-        </w:rPr>
-        <w:t>LO4: Design and run a multi-step workflow that separates parallel workstreams from dependencies, uses integrations deliberately, and places human approval gates before consequential writes or sharing.</w:t>
-      </w:r>
-    </w:p>
-    <w:p>
-      <w:pPr>
-        <w:pStyle w:val="ListBullet"/>
-      </w:pPr>
-      <w:r>
-        <w:rPr>
-          <w:sz w:val="21"/>
-        </w:rPr>
-        <w:t>LO5: Convert a successful session into a reusable playbook with parameters, project instructions, quality checks, exception paths, ownership, security controls, and a practical team rollout plan.</w:t>
-      </w:r>
-    </w:p>
-    <w:p>
-      <w:pPr>
-        <w:pStyle w:val="Heading1"/>
-      </w:pPr>
-      <w:r>
-        <w:t>Learning Reinforcement</w:t>
-      </w:r>
-    </w:p>
-    <w:p>
-      <w:pPr>
-        <w:pStyle w:val="ListBullet"/>
-      </w:pPr>
-      <w:r>
-        <w:rPr>
-          <w:sz w:val="21"/>
-        </w:rPr>
-        <w:t>Every topic is followed by hands-on labs that learners complete on their own machine.</w:t>
-      </w:r>
-    </w:p>
-    <w:p>
-      <w:pPr>
-        <w:pStyle w:val="ListBullet"/>
-      </w:pPr>
-      <w:r>
-        <w:rPr>
-          <w:sz w:val="21"/>
-        </w:rPr>
-        <w:t>Each lab ends with a 'Test it' verification step so learners can confirm their own progress.</w:t>
-      </w:r>
-    </w:p>
-    <w:p>
-      <w:pPr>
-        <w:pStyle w:val="ListBullet"/>
-      </w:pPr>
-      <w:r>
-        <w:rPr>
-          <w:sz w:val="21"/>
-        </w:rPr>
-        <w:t>The trainer circulates during lab time to give individual feedback and unblock learners.</w:t>
-      </w:r>
-    </w:p>
-    <w:p>
-      <w:pPr>
-        <w:pStyle w:val="ListBullet"/>
-      </w:pPr>
-      <w:r>
-        <w:rPr>
-          <w:sz w:val="21"/>
-        </w:rPr>
-        <w:t>Each topic closes with a recap mapped back to the course learning outcomes.</w:t>
-      </w:r>
-    </w:p>
-    <w:p>
-      <w:pPr>
-        <w:pStyle w:val="Heading1"/>
-      </w:pPr>
-      <w:r>
-        <w:t>Course Schedule</w:t>
-      </w:r>
-    </w:p>
-    <w:p>
-      <w:pPr>
-        <w:pStyle w:val="Heading2"/>
-      </w:pPr>
-      <w:r>
-        <w:t>Day 1 — Delegate, produce, and operationalise work with Claude Cowork</w:t>
-      </w:r>
-    </w:p>
-    <w:tbl>
-      <w:tblPr>
-        <w:tblStyle w:val="TableGrid"/>
-        <w:tblW w:type="auto" w:w="0"/>
-        <w:jc w:val="center"/>
-        <w:tblLook w:firstColumn="1" w:firstRow="1" w:lastColumn="0" w:lastRow="0" w:noHBand="0" w:noVBand="1" w:val="04A0"/>
-      </w:tblPr>
-      <w:tblGrid>
-        <w:gridCol w:w="2880"/>
-        <w:gridCol w:w="2880"/>
-        <w:gridCol w:w="2880"/>
-      </w:tblGrid>
-      <w:tr>
-        <w:trPr>
-          <w:tblHeader w:val="true"/>
-        </w:trPr>
-        <w:tc>
-          <w:tcPr>
-            <w:tcW w:type="dxa" w:w="1656"/>
-            <w:shd w:val="clear" w:color="auto" w:fill="1F6FEB"/>
-          </w:tcPr>
-          <w:p>
-            <w:r/>
-            <w:r>
-              <w:rPr>
-                <w:rFonts w:ascii="Arial" w:hAnsi="Arial"/>
-                <w:b/>
-                <w:color w:val="FFFFFF"/>
-                <w:sz w:val="20"/>
-              </w:rPr>
-              <w:t>Time</w:t>
-            </w:r>
-          </w:p>
-        </w:tc>
-        <w:tc>
-          <w:tcPr>
-            <w:tcW w:type="dxa" w:w="1296"/>
-            <w:shd w:val="clear" w:color="auto" w:fill="1F6FEB"/>
-          </w:tcPr>
-          <w:p>
-            <w:r/>
-            <w:r>
-              <w:rPr>
-                <w:rFonts w:ascii="Arial" w:hAnsi="Arial"/>
-                <w:b/>
-                <w:color w:val="FFFFFF"/>
-                <w:sz w:val="20"/>
-              </w:rPr>
-              <w:t>Duration</w:t>
-            </w:r>
-          </w:p>
-        </w:tc>
-        <w:tc>
-          <w:tcPr>
-            <w:tcW w:type="dxa" w:w="6840"/>
-            <w:shd w:val="clear" w:color="auto" w:fill="1F6FEB"/>
-          </w:tcPr>
-          <w:p>
-            <w:r/>
-            <w:r>
-              <w:rPr>
-                <w:rFonts w:ascii="Arial" w:hAnsi="Arial"/>
-                <w:b/>
-                <w:color w:val="FFFFFF"/>
-                <w:sz w:val="20"/>
-              </w:rPr>
-              <w:t>Topic / Activity</w:t>
-            </w:r>
-          </w:p>
-        </w:tc>
-      </w:tr>
-      <w:tr>
-        <w:trPr>
-          <w:cantSplit w:val="true"/>
-        </w:trPr>
-        <w:tc>
-          <w:tcPr>
-            <w:tcW w:type="dxa" w:w="1656"/>
-            <w:shd w:val="clear" w:color="auto" w:fill="F3F5F8"/>
-          </w:tcPr>
-          <w:p>
-            <w:r/>
-            <w:r>
-              <w:rPr>
-                <w:rFonts w:ascii="Arial" w:hAnsi="Arial"/>
-                <w:b w:val="0"/>
-                <w:sz w:val="19"/>
-              </w:rPr>
-              <w:t>9:00–9:20</w:t>
-            </w:r>
-          </w:p>
-        </w:tc>
-        <w:tc>
-          <w:tcPr>
-            <w:tcW w:type="dxa" w:w="1296"/>
-            <w:shd w:val="clear" w:color="auto" w:fill="F3F5F8"/>
-          </w:tcPr>
-          <w:p>
-            <w:r/>
-            <w:r>
-              <w:rPr>
-                <w:rFonts w:ascii="Arial" w:hAnsi="Arial"/>
-                <w:b w:val="0"/>
-                <w:sz w:val="19"/>
-              </w:rPr>
-              <w:t>20 min</w:t>
-            </w:r>
-          </w:p>
-        </w:tc>
-        <w:tc>
-          <w:tcPr>
-            <w:tcW w:type="dxa" w:w="6840"/>
-            <w:shd w:val="clear" w:color="auto" w:fill="F3F5F8"/>
-          </w:tcPr>
-          <w:p>
-            <w:r/>
-            <w:r>
-              <w:rPr>
-                <w:rFonts w:ascii="Arial" w:hAnsi="Arial"/>
-                <w:b w:val="0"/>
-                <w:sz w:val="19"/>
-              </w:rPr>
-              <w:t>Welcome, course orientation, learning outcomes, working agreement, and synthetic-data scenario</w:t>
-            </w:r>
-          </w:p>
-        </w:tc>
-      </w:tr>
-      <w:tr>
-        <w:trPr>
-          <w:cantSplit w:val="true"/>
-        </w:trPr>
-        <w:tc>
-          <w:tcPr>
-            <w:tcW w:type="dxa" w:w="1656"/>
-            <w:shd w:val="clear" w:color="auto" w:fill="E8F0FE"/>
-          </w:tcPr>
-          <w:p>
-            <w:r/>
-            <w:r>
-              <w:rPr>
-                <w:rFonts w:ascii="Arial" w:hAnsi="Arial"/>
-                <w:b/>
-                <w:sz w:val="19"/>
-              </w:rPr>
-              <w:t>9:20–10:05</w:t>
-            </w:r>
-          </w:p>
-        </w:tc>
-        <w:tc>
-          <w:tcPr>
-            <w:tcW w:type="dxa" w:w="1296"/>
-            <w:shd w:val="clear" w:color="auto" w:fill="E8F0FE"/>
-          </w:tcPr>
-          <w:p>
-            <w:r/>
-            <w:r>
-              <w:rPr>
-                <w:rFonts w:ascii="Arial" w:hAnsi="Arial"/>
-                <w:b w:val="0"/>
-                <w:sz w:val="19"/>
-              </w:rPr>
-              <w:t>45 min</w:t>
-            </w:r>
-          </w:p>
-        </w:tc>
-        <w:tc>
-          <w:tcPr>
-            <w:tcW w:type="dxa" w:w="6840"/>
-            <w:shd w:val="clear" w:color="auto" w:fill="E8F0FE"/>
-          </w:tcPr>
-          <w:p>
-            <w:r/>
-            <w:r>
-              <w:rPr>
-                <w:rFonts w:ascii="Arial" w:hAnsi="Arial"/>
-                <w:b/>
-                <w:sz w:val="19"/>
-              </w:rPr>
-              <w:t>Topic 1 - Getting Started with Claude Cowork: operating model, setup, task briefs, permissions, monitoring, and review</w:t>
-            </w:r>
-          </w:p>
-        </w:tc>
-      </w:tr>
-      <w:tr>
-        <w:trPr>
-          <w:cantSplit w:val="true"/>
-        </w:trPr>
-        <w:tc>
-          <w:tcPr>
-            <w:tcW w:type="dxa" w:w="1656"/>
-            <w:shd w:val="clear" w:color="auto" w:fill="FFF4E5"/>
-          </w:tcPr>
-          <w:p>
-            <w:r/>
-            <w:r>
-              <w:rPr>
-                <w:rFonts w:ascii="Arial" w:hAnsi="Arial"/>
-                <w:b w:val="0"/>
-                <w:sz w:val="19"/>
-              </w:rPr>
-              <w:t>10:05–10:20</w:t>
-            </w:r>
-          </w:p>
-        </w:tc>
-        <w:tc>
-          <w:tcPr>
-            <w:tcW w:type="dxa" w:w="1296"/>
-            <w:shd w:val="clear" w:color="auto" w:fill="FFF4E5"/>
-          </w:tcPr>
-          <w:p>
-            <w:r/>
-            <w:r>
-              <w:rPr>
-                <w:rFonts w:ascii="Arial" w:hAnsi="Arial"/>
-                <w:b w:val="0"/>
-                <w:sz w:val="19"/>
-              </w:rPr>
-              <w:t>15 min</w:t>
-            </w:r>
-          </w:p>
-        </w:tc>
-        <w:tc>
-          <w:tcPr>
-            <w:tcW w:type="dxa" w:w="6840"/>
-            <w:shd w:val="clear" w:color="auto" w:fill="FFF4E5"/>
-          </w:tcPr>
-          <w:p>
-            <w:r/>
-            <w:r>
-              <w:rPr>
-                <w:rFonts w:ascii="Arial" w:hAnsi="Arial"/>
-                <w:b w:val="0"/>
-                <w:sz w:val="19"/>
-              </w:rPr>
-              <w:t>Tea break</w:t>
-            </w:r>
-          </w:p>
-        </w:tc>
-      </w:tr>
-      <w:tr>
-        <w:trPr>
-          <w:cantSplit w:val="true"/>
-        </w:trPr>
-        <w:tc>
-          <w:tcPr>
-            <w:tcW w:type="dxa" w:w="1656"/>
-          </w:tcPr>
-          <w:p>
-            <w:r/>
-            <w:r>
-              <w:rPr>
-                <w:rFonts w:ascii="Arial" w:hAnsi="Arial"/>
-                <w:b w:val="0"/>
-                <w:sz w:val="19"/>
-              </w:rPr>
-              <w:t>10:20–11:35</w:t>
-            </w:r>
-          </w:p>
-        </w:tc>
-        <w:tc>
-          <w:tcPr>
-            <w:tcW w:type="dxa" w:w="1296"/>
-          </w:tcPr>
-          <w:p>
-            <w:r/>
-            <w:r>
-              <w:rPr>
-                <w:rFonts w:ascii="Arial" w:hAnsi="Arial"/>
-                <w:b w:val="0"/>
-                <w:sz w:val="19"/>
-              </w:rPr>
-              <w:t>75 min</w:t>
-            </w:r>
-          </w:p>
-        </w:tc>
-        <w:tc>
-          <w:tcPr>
-            <w:tcW w:type="dxa" w:w="6840"/>
-          </w:tcPr>
-          <w:p>
-            <w:r/>
-            <w:r>
-              <w:rPr>
-                <w:rFonts w:ascii="Arial" w:hAnsi="Arial"/>
-                <w:b w:val="0"/>
-                <w:sz w:val="19"/>
-              </w:rPr>
-              <w:t>Hands-on: Lab 1: Delegate Your First Task to Claude Cowork</w:t>
-            </w:r>
-          </w:p>
-        </w:tc>
-      </w:tr>
-      <w:tr>
-        <w:trPr>
-          <w:cantSplit w:val="true"/>
-        </w:trPr>
-        <w:tc>
-          <w:tcPr>
-            <w:tcW w:type="dxa" w:w="1656"/>
-            <w:shd w:val="clear" w:color="auto" w:fill="E8F0FE"/>
-          </w:tcPr>
-          <w:p>
-            <w:r/>
-            <w:r>
-              <w:rPr>
-                <w:rFonts w:ascii="Arial" w:hAnsi="Arial"/>
-                <w:b/>
-                <w:sz w:val="19"/>
-              </w:rPr>
-              <w:t>11:35–12:20</w:t>
-            </w:r>
-          </w:p>
-        </w:tc>
-        <w:tc>
-          <w:tcPr>
-            <w:tcW w:type="dxa" w:w="1296"/>
-            <w:shd w:val="clear" w:color="auto" w:fill="E8F0FE"/>
-          </w:tcPr>
-          <w:p>
-            <w:r/>
-            <w:r>
-              <w:rPr>
-                <w:rFonts w:ascii="Arial" w:hAnsi="Arial"/>
-                <w:b w:val="0"/>
-                <w:sz w:val="19"/>
-              </w:rPr>
-              <w:t>45 min</w:t>
-            </w:r>
-          </w:p>
-        </w:tc>
-        <w:tc>
-          <w:tcPr>
-            <w:tcW w:type="dxa" w:w="6840"/>
-            <w:shd w:val="clear" w:color="auto" w:fill="E8F0FE"/>
-          </w:tcPr>
-          <w:p>
-            <w:r/>
-            <w:r>
-              <w:rPr>
-                <w:rFonts w:ascii="Arial" w:hAnsi="Arial"/>
-                <w:b/>
-                <w:sz w:val="19"/>
-              </w:rPr>
-              <w:t>Topic 2 - Automating Everyday Work with Cowork: file, document, spreadsheet, research, and multi-step workflow concepts</w:t>
-            </w:r>
-          </w:p>
-        </w:tc>
-      </w:tr>
-      <w:tr>
-        <w:trPr>
-          <w:cantSplit w:val="true"/>
-        </w:trPr>
-        <w:tc>
-          <w:tcPr>
-            <w:tcW w:type="dxa" w:w="1656"/>
-            <w:shd w:val="clear" w:color="auto" w:fill="FDE9D9"/>
-          </w:tcPr>
-          <w:p>
-            <w:r/>
-            <w:r>
-              <w:rPr>
-                <w:rFonts w:ascii="Arial" w:hAnsi="Arial"/>
-                <w:b w:val="0"/>
-                <w:sz w:val="19"/>
-              </w:rPr>
-              <w:t>12:20–13:20</w:t>
-            </w:r>
-          </w:p>
-        </w:tc>
-        <w:tc>
-          <w:tcPr>
-            <w:tcW w:type="dxa" w:w="1296"/>
-            <w:shd w:val="clear" w:color="auto" w:fill="FDE9D9"/>
-          </w:tcPr>
-          <w:p>
-            <w:r/>
-            <w:r>
-              <w:rPr>
-                <w:rFonts w:ascii="Arial" w:hAnsi="Arial"/>
-                <w:b w:val="0"/>
-                <w:sz w:val="19"/>
-              </w:rPr>
-              <w:t>60 min</w:t>
-            </w:r>
-          </w:p>
-        </w:tc>
-        <w:tc>
-          <w:tcPr>
-            <w:tcW w:type="dxa" w:w="6840"/>
-            <w:shd w:val="clear" w:color="auto" w:fill="FDE9D9"/>
-          </w:tcPr>
-          <w:p>
-            <w:r/>
-            <w:r>
-              <w:rPr>
-                <w:rFonts w:ascii="Arial" w:hAnsi="Arial"/>
-                <w:b w:val="0"/>
-                <w:sz w:val="19"/>
-              </w:rPr>
-              <w:t>Lunch break</w:t>
-            </w:r>
-          </w:p>
-        </w:tc>
-      </w:tr>
-      <w:tr>
-        <w:trPr>
-          <w:cantSplit w:val="true"/>
-        </w:trPr>
-        <w:tc>
-          <w:tcPr>
-            <w:tcW w:type="dxa" w:w="1656"/>
-          </w:tcPr>
-          <w:p>
-            <w:r/>
-            <w:r>
-              <w:rPr>
-                <w:rFonts w:ascii="Arial" w:hAnsi="Arial"/>
-                <w:b w:val="0"/>
-                <w:sz w:val="19"/>
-              </w:rPr>
-              <w:t>13:20–15:05</w:t>
-            </w:r>
-          </w:p>
-        </w:tc>
-        <w:tc>
-          <w:tcPr>
-            <w:tcW w:type="dxa" w:w="1296"/>
-          </w:tcPr>
-          <w:p>
-            <w:r/>
-            <w:r>
-              <w:rPr>
-                <w:rFonts w:ascii="Arial" w:hAnsi="Arial"/>
-                <w:b w:val="0"/>
-                <w:sz w:val="19"/>
-              </w:rPr>
-              <w:t>105 min</w:t>
-            </w:r>
-          </w:p>
-        </w:tc>
-        <w:tc>
-          <w:tcPr>
-            <w:tcW w:type="dxa" w:w="6840"/>
-          </w:tcPr>
-          <w:p>
-            <w:r/>
-            <w:r>
-              <w:rPr>
-                <w:rFonts w:ascii="Arial" w:hAnsi="Arial"/>
-                <w:b w:val="0"/>
-                <w:sz w:val="19"/>
-              </w:rPr>
-              <w:t>Hands-on: Lab 2: Turn a Messy Folder into a Management-Ready Report</w:t>
-            </w:r>
-          </w:p>
-        </w:tc>
-      </w:tr>
-      <w:tr>
-        <w:trPr>
-          <w:cantSplit w:val="true"/>
-        </w:trPr>
-        <w:tc>
-          <w:tcPr>
-            <w:tcW w:type="dxa" w:w="1656"/>
-            <w:shd w:val="clear" w:color="auto" w:fill="FFF4E5"/>
-          </w:tcPr>
-          <w:p>
-            <w:r/>
-            <w:r>
-              <w:rPr>
-                <w:rFonts w:ascii="Arial" w:hAnsi="Arial"/>
-                <w:b w:val="0"/>
-                <w:sz w:val="19"/>
-              </w:rPr>
-              <w:t>15:05–15:20</w:t>
-            </w:r>
-          </w:p>
-        </w:tc>
-        <w:tc>
-          <w:tcPr>
-            <w:tcW w:type="dxa" w:w="1296"/>
-            <w:shd w:val="clear" w:color="auto" w:fill="FFF4E5"/>
-          </w:tcPr>
-          <w:p>
-            <w:r/>
-            <w:r>
-              <w:rPr>
-                <w:rFonts w:ascii="Arial" w:hAnsi="Arial"/>
-                <w:b w:val="0"/>
-                <w:sz w:val="19"/>
-              </w:rPr>
-              <w:t>15 min</w:t>
-            </w:r>
-          </w:p>
-        </w:tc>
-        <w:tc>
-          <w:tcPr>
-            <w:tcW w:type="dxa" w:w="6840"/>
-            <w:shd w:val="clear" w:color="auto" w:fill="FFF4E5"/>
-          </w:tcPr>
-          <w:p>
-            <w:r/>
-            <w:r>
-              <w:rPr>
-                <w:rFonts w:ascii="Arial" w:hAnsi="Arial"/>
-                <w:b w:val="0"/>
-                <w:sz w:val="19"/>
-              </w:rPr>
-              <w:t>Tea break</w:t>
-            </w:r>
-          </w:p>
-        </w:tc>
-      </w:tr>
-      <w:tr>
-        <w:trPr>
-          <w:cantSplit w:val="true"/>
-        </w:trPr>
-        <w:tc>
-          <w:tcPr>
-            <w:tcW w:type="dxa" w:w="1656"/>
-            <w:shd w:val="clear" w:color="auto" w:fill="E8F0FE"/>
-          </w:tcPr>
-          <w:p>
-            <w:r/>
-            <w:r>
-              <w:rPr>
-                <w:rFonts w:ascii="Arial" w:hAnsi="Arial"/>
-                <w:b/>
-                <w:sz w:val="19"/>
-              </w:rPr>
-              <w:t>15:20–15:50</w:t>
-            </w:r>
-          </w:p>
-        </w:tc>
-        <w:tc>
-          <w:tcPr>
-            <w:tcW w:type="dxa" w:w="1296"/>
-            <w:shd w:val="clear" w:color="auto" w:fill="E8F0FE"/>
-          </w:tcPr>
-          <w:p>
-            <w:r/>
-            <w:r>
-              <w:rPr>
-                <w:rFonts w:ascii="Arial" w:hAnsi="Arial"/>
-                <w:b w:val="0"/>
-                <w:sz w:val="19"/>
-              </w:rPr>
-              <w:t>30 min</w:t>
-            </w:r>
-          </w:p>
-        </w:tc>
-        <w:tc>
-          <w:tcPr>
-            <w:tcW w:type="dxa" w:w="6840"/>
-            <w:shd w:val="clear" w:color="auto" w:fill="E8F0FE"/>
-          </w:tcPr>
-          <w:p>
-            <w:r/>
-            <w:r>
-              <w:rPr>
-                <w:rFonts w:ascii="Arial" w:hAnsi="Arial"/>
-                <w:b/>
-                <w:sz w:val="19"/>
-              </w:rPr>
-              <w:t>Topic 3 - Advanced Cowork Workflows: integrations, playbooks, parallel work, human gates, security, and rollout</w:t>
-            </w:r>
-          </w:p>
-        </w:tc>
-      </w:tr>
-      <w:tr>
-        <w:trPr>
-          <w:cantSplit w:val="true"/>
-        </w:trPr>
-        <w:tc>
-          <w:tcPr>
-            <w:tcW w:type="dxa" w:w="1656"/>
-          </w:tcPr>
-          <w:p>
-            <w:r/>
-            <w:r>
-              <w:rPr>
-                <w:rFonts w:ascii="Arial" w:hAnsi="Arial"/>
-                <w:b w:val="0"/>
-                <w:sz w:val="19"/>
-              </w:rPr>
-              <w:t>15:50–17:15</w:t>
-            </w:r>
-          </w:p>
-        </w:tc>
-        <w:tc>
-          <w:tcPr>
-            <w:tcW w:type="dxa" w:w="1296"/>
-          </w:tcPr>
-          <w:p>
-            <w:r/>
-            <w:r>
-              <w:rPr>
-                <w:rFonts w:ascii="Arial" w:hAnsi="Arial"/>
-                <w:b w:val="0"/>
-                <w:sz w:val="19"/>
-              </w:rPr>
-              <w:t>85 min</w:t>
-            </w:r>
-          </w:p>
-        </w:tc>
-        <w:tc>
-          <w:tcPr>
-            <w:tcW w:type="dxa" w:w="6840"/>
-          </w:tcPr>
-          <w:p>
-            <w:r/>
-            <w:r>
-              <w:rPr>
-                <w:rFonts w:ascii="Arial" w:hAnsi="Arial"/>
-                <w:b w:val="0"/>
-                <w:sz w:val="19"/>
-              </w:rPr>
-              <w:t>Hands-on: Lab 3: Build a Repeatable Cowork Workflow for Your Own Work</w:t>
-            </w:r>
-          </w:p>
-        </w:tc>
-      </w:tr>
-      <w:tr>
-        <w:trPr>
-          <w:cantSplit w:val="true"/>
-        </w:trPr>
-        <w:tc>
-          <w:tcPr>
-            <w:tcW w:type="dxa" w:w="1656"/>
-            <w:shd w:val="clear" w:color="auto" w:fill="F3F5F8"/>
-          </w:tcPr>
-          <w:p>
-            <w:r/>
-            <w:r>
-              <w:rPr>
-                <w:rFonts w:ascii="Arial" w:hAnsi="Arial"/>
-                <w:b w:val="0"/>
-                <w:sz w:val="19"/>
-              </w:rPr>
-              <w:t>17:15–17:30</w:t>
-            </w:r>
-          </w:p>
-        </w:tc>
-        <w:tc>
-          <w:tcPr>
-            <w:tcW w:type="dxa" w:w="1296"/>
-            <w:shd w:val="clear" w:color="auto" w:fill="F3F5F8"/>
-          </w:tcPr>
-          <w:p>
-            <w:r/>
-            <w:r>
-              <w:rPr>
-                <w:rFonts w:ascii="Arial" w:hAnsi="Arial"/>
-                <w:b w:val="0"/>
-                <w:sz w:val="19"/>
-              </w:rPr>
-              <w:t>15 min</w:t>
-            </w:r>
-          </w:p>
-        </w:tc>
-        <w:tc>
-          <w:tcPr>
-            <w:tcW w:type="dxa" w:w="6840"/>
-            <w:shd w:val="clear" w:color="auto" w:fill="F3F5F8"/>
-          </w:tcPr>
-          <w:p>
-            <w:r/>
-            <w:r>
-              <w:rPr>
-                <w:rFonts w:ascii="Arial" w:hAnsi="Arial"/>
-                <w:b w:val="0"/>
-                <w:sz w:val="19"/>
-              </w:rPr>
-              <w:t>Course recap, action plan, and questions mapped to the five learning outcomes</w:t>
-            </w:r>
-          </w:p>
-        </w:tc>
-      </w:tr>
-    </w:tbl>
-    <w:p>
-      <w:r>
-        <w:rPr>
-          <w:i/>
-          <w:color w:val="555B66"/>
-          <w:sz w:val="19"/>
-        </w:rPr>
-        <w:t>Total scheduled time: 450 minutes (7.5 hours) excluding lunch — of which 420 minutes (7 hours) are instructional, plus 30 minutes of tea breaks.</w:t>
-      </w:r>
-    </w:p>
-    <w:p>
-      <w:pPr>
-        <w:pStyle w:val="Heading1"/>
-      </w:pPr>
-      <w:r>
-        <w:t>Lab Reference (aligned to course topics)</w:t>
+        <w:t>Document Version Control Record</w:t>
       </w:r>
     </w:p>
     <w:tbl>
@@ -1568,60 +35,33 @@
         <w:gridCol w:w="2880"/>
       </w:tblGrid>
       <w:tr>
-        <w:trPr>
-          <w:tblHeader w:val="true"/>
-        </w:trPr>
         <w:tc>
           <w:tcPr>
             <w:tcW w:type="dxa" w:w="2880"/>
-            <w:shd w:val="clear" w:color="auto" w:fill="1F6FEB"/>
           </w:tcPr>
           <w:p>
-            <w:r/>
             <w:r>
-              <w:rPr>
-                <w:rFonts w:ascii="Arial" w:hAnsi="Arial"/>
-                <w:b/>
-                <w:color w:val="FFFFFF"/>
-                <w:sz w:val="20"/>
-              </w:rPr>
-              <w:t>Topic</w:t>
+              <w:t>Version</w:t>
             </w:r>
           </w:p>
         </w:tc>
         <w:tc>
           <w:tcPr>
             <w:tcW w:type="dxa" w:w="2880"/>
-            <w:shd w:val="clear" w:color="auto" w:fill="1F6FEB"/>
           </w:tcPr>
           <w:p>
-            <w:r/>
             <w:r>
-              <w:rPr>
-                <w:rFonts w:ascii="Arial" w:hAnsi="Arial"/>
-                <w:b/>
-                <w:color w:val="FFFFFF"/>
-                <w:sz w:val="20"/>
-              </w:rPr>
-              <w:t>Coverage</w:t>
+              <w:t>Date</w:t>
             </w:r>
           </w:p>
         </w:tc>
         <w:tc>
           <w:tcPr>
             <w:tcW w:type="dxa" w:w="2880"/>
-            <w:shd w:val="clear" w:color="auto" w:fill="1F6FEB"/>
           </w:tcPr>
           <w:p>
-            <w:r/>
             <w:r>
-              <w:rPr>
-                <w:rFonts w:ascii="Arial" w:hAnsi="Arial"/>
-                <w:b/>
-                <w:color w:val="FFFFFF"/>
-                <w:sz w:val="20"/>
-              </w:rPr>
-              <w:t>Labs</w:t>
+              <w:t>Change</w:t>
             </w:r>
           </w:p>
         </w:tc>
@@ -1630,34 +70,10 @@
         <w:tc>
           <w:tcPr>
             <w:tcW w:type="dxa" w:w="2880"/>
-            <w:shd w:val="clear" w:color="auto" w:fill="E8F0FE"/>
           </w:tcPr>
           <w:p>
-            <w:r/>
             <w:r>
-              <w:rPr>
-                <w:rFonts w:ascii="Arial" w:hAnsi="Arial"/>
-                <w:b/>
-                <w:sz w:val="19"/>
-              </w:rPr>
-              <w:t>Topic 01: Getting Started with Claude Cowork</w:t>
-            </w:r>
-          </w:p>
-        </w:tc>
-        <w:tc>
-          <w:tcPr>
-            <w:tcW w:type="dxa" w:w="2880"/>
-            <w:shd w:val="clear" w:color="auto" w:fill="E8F0FE"/>
-          </w:tcPr>
-          <w:p>
-            <w:r/>
-            <w:r>
-              <w:rPr>
-                <w:rFonts w:ascii="Arial" w:hAnsi="Arial"/>
-                <w:b w:val="0"/>
-                <w:sz w:val="19"/>
-              </w:rPr>
-              <w:t>1 of 3 labs (33%)</w:t>
+              <w:t>v2.0</w:t>
             </w:r>
           </w:p>
         </w:tc>
@@ -1666,14 +82,102 @@
             <w:tcW w:type="dxa" w:w="2880"/>
           </w:tcPr>
           <w:p>
-            <w:r/>
             <w:r>
-              <w:rPr>
-                <w:rFonts w:ascii="Arial" w:hAnsi="Arial"/>
-                <w:b w:val="0"/>
-                <w:sz w:val="19"/>
-              </w:rPr>
-              <w:t>Lab 1</w:t>
+              <w:t>15 September 2026</w:t>
+            </w:r>
+          </w:p>
+        </w:tc>
+        <w:tc>
+          <w:tcPr>
+            <w:tcW w:type="dxa" w:w="2880"/>
+          </w:tcPr>
+          <w:p>
+            <w:r>
+              <w:t>Finance project, Excel and Outlook release</w:t>
+            </w:r>
+          </w:p>
+        </w:tc>
+      </w:tr>
+    </w:tbl>
+    <w:p>
+      <w:pPr>
+        <w:pStyle w:val="Heading1"/>
+      </w:pPr>
+      <w:r>
+        <w:t>Learning outcomes</w:t>
+      </w:r>
+    </w:p>
+    <w:p>
+      <w:pPr>
+        <w:pStyle w:val="ListBullet"/>
+      </w:pPr>
+      <w:r>
+        <w:t>Create a bounded finance Cowork project with durable controls.</w:t>
+      </w:r>
+    </w:p>
+    <w:p>
+      <w:pPr>
+        <w:pStyle w:val="ListBullet"/>
+      </w:pPr>
+      <w:r>
+        <w:t>Build and reconcile a formula-driven Excel finance report from synthetic transactions.</w:t>
+      </w:r>
+    </w:p>
+    <w:p>
+      <w:pPr>
+        <w:pStyle w:val="ListBullet"/>
+      </w:pPr>
+      <w:r>
+        <w:t>Schedule a repeatable run and deliver an approved .xlsx through Outlook using Power Automate.</w:t>
+      </w:r>
+    </w:p>
+    <w:p>
+      <w:pPr>
+        <w:pStyle w:val="Heading1"/>
+      </w:pPr>
+      <w:r>
+        <w:t>Course schedule</w:t>
+      </w:r>
+    </w:p>
+    <w:tbl>
+      <w:tblPr>
+        <w:tblStyle w:val="TableGrid"/>
+        <w:tblW w:type="auto" w:w="0"/>
+        <w:tblLook w:firstColumn="1" w:firstRow="1" w:lastColumn="0" w:lastRow="0" w:noHBand="0" w:noVBand="1" w:val="04A0"/>
+      </w:tblPr>
+      <w:tblGrid>
+        <w:gridCol w:w="2880"/>
+        <w:gridCol w:w="2880"/>
+        <w:gridCol w:w="2880"/>
+      </w:tblGrid>
+      <w:tr>
+        <w:tc>
+          <w:tcPr>
+            <w:tcW w:type="dxa" w:w="2880"/>
+          </w:tcPr>
+          <w:p>
+            <w:r>
+              <w:t>Time</w:t>
+            </w:r>
+          </w:p>
+        </w:tc>
+        <w:tc>
+          <w:tcPr>
+            <w:tcW w:type="dxa" w:w="2880"/>
+          </w:tcPr>
+          <w:p>
+            <w:r>
+              <w:t>Minutes</w:t>
+            </w:r>
+          </w:p>
+        </w:tc>
+        <w:tc>
+          <w:tcPr>
+            <w:tcW w:type="dxa" w:w="2880"/>
+          </w:tcPr>
+          <w:p>
+            <w:r>
+              <w:t>Session</w:t>
             </w:r>
           </w:p>
         </w:tc>
@@ -1682,34 +186,10 @@
         <w:tc>
           <w:tcPr>
             <w:tcW w:type="dxa" w:w="2880"/>
-            <w:shd w:val="clear" w:color="auto" w:fill="E8F0FE"/>
           </w:tcPr>
           <w:p>
-            <w:r/>
             <w:r>
-              <w:rPr>
-                <w:rFonts w:ascii="Arial" w:hAnsi="Arial"/>
-                <w:b/>
-                <w:sz w:val="19"/>
-              </w:rPr>
-              <w:t>Topic 02: Automating Everyday Work with Cowork</w:t>
-            </w:r>
-          </w:p>
-        </w:tc>
-        <w:tc>
-          <w:tcPr>
-            <w:tcW w:type="dxa" w:w="2880"/>
-            <w:shd w:val="clear" w:color="auto" w:fill="E8F0FE"/>
-          </w:tcPr>
-          <w:p>
-            <w:r/>
-            <w:r>
-              <w:rPr>
-                <w:rFonts w:ascii="Arial" w:hAnsi="Arial"/>
-                <w:b w:val="0"/>
-                <w:sz w:val="19"/>
-              </w:rPr>
-              <w:t>1 of 3 labs (33%)</w:t>
+              <w:t>09:00–09:15</w:t>
             </w:r>
           </w:p>
         </w:tc>
@@ -1718,14 +198,18 @@
             <w:tcW w:type="dxa" w:w="2880"/>
           </w:tcPr>
           <w:p>
-            <w:r/>
             <w:r>
-              <w:rPr>
-                <w:rFonts w:ascii="Arial" w:hAnsi="Arial"/>
-                <w:b w:val="0"/>
-                <w:sz w:val="19"/>
-              </w:rPr>
-              <w:t>Lab 2</w:t>
+              <w:t>15</w:t>
+            </w:r>
+          </w:p>
+        </w:tc>
+        <w:tc>
+          <w:tcPr>
+            <w:tcW w:type="dxa" w:w="2880"/>
+          </w:tcPr>
+          <w:p>
+            <w:r>
+              <w:t>Welcome, scenario and boundaries</w:t>
             </w:r>
           </w:p>
         </w:tc>
@@ -1734,34 +218,10 @@
         <w:tc>
           <w:tcPr>
             <w:tcW w:type="dxa" w:w="2880"/>
-            <w:shd w:val="clear" w:color="auto" w:fill="E8F0FE"/>
           </w:tcPr>
           <w:p>
-            <w:r/>
             <w:r>
-              <w:rPr>
-                <w:rFonts w:ascii="Arial" w:hAnsi="Arial"/>
-                <w:b/>
-                <w:sz w:val="19"/>
-              </w:rPr>
-              <w:t>Topic 03: Advanced Cowork Workflows</w:t>
-            </w:r>
-          </w:p>
-        </w:tc>
-        <w:tc>
-          <w:tcPr>
-            <w:tcW w:type="dxa" w:w="2880"/>
-            <w:shd w:val="clear" w:color="auto" w:fill="E8F0FE"/>
-          </w:tcPr>
-          <w:p>
-            <w:r/>
-            <w:r>
-              <w:rPr>
-                <w:rFonts w:ascii="Arial" w:hAnsi="Arial"/>
-                <w:b w:val="0"/>
-                <w:sz w:val="19"/>
-              </w:rPr>
-              <w:t>1 of 3 labs (33%)</w:t>
+              <w:t>09:15–10:20</w:t>
             </w:r>
           </w:p>
         </w:tc>
@@ -1770,21 +230,362 @@
             <w:tcW w:type="dxa" w:w="2880"/>
           </w:tcPr>
           <w:p>
-            <w:r/>
             <w:r>
-              <w:rPr>
-                <w:rFonts w:ascii="Arial" w:hAnsi="Arial"/>
-                <w:b w:val="0"/>
-                <w:sz w:val="19"/>
-              </w:rPr>
-              <w:t>Lab 3</w:t>
+              <w:t>65</w:t>
+            </w:r>
+          </w:p>
+        </w:tc>
+        <w:tc>
+          <w:tcPr>
+            <w:tcW w:type="dxa" w:w="2880"/>
+          </w:tcPr>
+          <w:p>
+            <w:r>
+              <w:t>Topic 1: project scope, source schema, instructions</w:t>
+            </w:r>
+          </w:p>
+        </w:tc>
+      </w:tr>
+      <w:tr>
+        <w:tc>
+          <w:tcPr>
+            <w:tcW w:type="dxa" w:w="2880"/>
+          </w:tcPr>
+          <w:p>
+            <w:r>
+              <w:t>10:20–10:35</w:t>
+            </w:r>
+          </w:p>
+        </w:tc>
+        <w:tc>
+          <w:tcPr>
+            <w:tcW w:type="dxa" w:w="2880"/>
+          </w:tcPr>
+          <w:p>
+            <w:r>
+              <w:t>15</w:t>
+            </w:r>
+          </w:p>
+        </w:tc>
+        <w:tc>
+          <w:tcPr>
+            <w:tcW w:type="dxa" w:w="2880"/>
+          </w:tcPr>
+          <w:p>
+            <w:r>
+              <w:t>Tea break</w:t>
+            </w:r>
+          </w:p>
+        </w:tc>
+      </w:tr>
+      <w:tr>
+        <w:tc>
+          <w:tcPr>
+            <w:tcW w:type="dxa" w:w="2880"/>
+          </w:tcPr>
+          <w:p>
+            <w:r>
+              <w:t>10:35–11:30</w:t>
+            </w:r>
+          </w:p>
+        </w:tc>
+        <w:tc>
+          <w:tcPr>
+            <w:tcW w:type="dxa" w:w="2880"/>
+          </w:tcPr>
+          <w:p>
+            <w:r>
+              <w:t>55</w:t>
+            </w:r>
+          </w:p>
+        </w:tc>
+        <w:tc>
+          <w:tcPr>
+            <w:tcW w:type="dxa" w:w="2880"/>
+          </w:tcPr>
+          <w:p>
+            <w:r>
+              <w:t>Lab 1: finance Cowork project</w:t>
+            </w:r>
+          </w:p>
+        </w:tc>
+      </w:tr>
+      <w:tr>
+        <w:tc>
+          <w:tcPr>
+            <w:tcW w:type="dxa" w:w="2880"/>
+          </w:tcPr>
+          <w:p>
+            <w:r>
+              <w:t>11:30–12:25</w:t>
+            </w:r>
+          </w:p>
+        </w:tc>
+        <w:tc>
+          <w:tcPr>
+            <w:tcW w:type="dxa" w:w="2880"/>
+          </w:tcPr>
+          <w:p>
+            <w:r>
+              <w:t>55</w:t>
+            </w:r>
+          </w:p>
+        </w:tc>
+        <w:tc>
+          <w:tcPr>
+            <w:tcW w:type="dxa" w:w="2880"/>
+          </w:tcPr>
+          <w:p>
+            <w:r>
+              <w:t>Topic 2: eligibility, formulas and exceptions</w:t>
+            </w:r>
+          </w:p>
+        </w:tc>
+      </w:tr>
+      <w:tr>
+        <w:tc>
+          <w:tcPr>
+            <w:tcW w:type="dxa" w:w="2880"/>
+          </w:tcPr>
+          <w:p>
+            <w:r>
+              <w:t>12:25–13:25</w:t>
+            </w:r>
+          </w:p>
+        </w:tc>
+        <w:tc>
+          <w:tcPr>
+            <w:tcW w:type="dxa" w:w="2880"/>
+          </w:tcPr>
+          <w:p>
+            <w:r>
+              <w:t>60</w:t>
+            </w:r>
+          </w:p>
+        </w:tc>
+        <w:tc>
+          <w:tcPr>
+            <w:tcW w:type="dxa" w:w="2880"/>
+          </w:tcPr>
+          <w:p>
+            <w:r>
+              <w:t>Lunch</w:t>
+            </w:r>
+          </w:p>
+        </w:tc>
+      </w:tr>
+      <w:tr>
+        <w:tc>
+          <w:tcPr>
+            <w:tcW w:type="dxa" w:w="2880"/>
+          </w:tcPr>
+          <w:p>
+            <w:r>
+              <w:t>13:25–15:25</w:t>
+            </w:r>
+          </w:p>
+        </w:tc>
+        <w:tc>
+          <w:tcPr>
+            <w:tcW w:type="dxa" w:w="2880"/>
+          </w:tcPr>
+          <w:p>
+            <w:r>
+              <w:t>120</w:t>
+            </w:r>
+          </w:p>
+        </w:tc>
+        <w:tc>
+          <w:tcPr>
+            <w:tcW w:type="dxa" w:w="2880"/>
+          </w:tcPr>
+          <w:p>
+            <w:r>
+              <w:t>Lab 2: automate finance Excel</w:t>
+            </w:r>
+          </w:p>
+        </w:tc>
+      </w:tr>
+      <w:tr>
+        <w:tc>
+          <w:tcPr>
+            <w:tcW w:type="dxa" w:w="2880"/>
+          </w:tcPr>
+          <w:p>
+            <w:r>
+              <w:t>15:25–15:40</w:t>
+            </w:r>
+          </w:p>
+        </w:tc>
+        <w:tc>
+          <w:tcPr>
+            <w:tcW w:type="dxa" w:w="2880"/>
+          </w:tcPr>
+          <w:p>
+            <w:r>
+              <w:t>15</w:t>
+            </w:r>
+          </w:p>
+        </w:tc>
+        <w:tc>
+          <w:tcPr>
+            <w:tcW w:type="dxa" w:w="2880"/>
+          </w:tcPr>
+          <w:p>
+            <w:r>
+              <w:t>Tea break</w:t>
+            </w:r>
+          </w:p>
+        </w:tc>
+      </w:tr>
+      <w:tr>
+        <w:tc>
+          <w:tcPr>
+            <w:tcW w:type="dxa" w:w="2880"/>
+          </w:tcPr>
+          <w:p>
+            <w:r>
+              <w:t>15:40–16:30</w:t>
+            </w:r>
+          </w:p>
+        </w:tc>
+        <w:tc>
+          <w:tcPr>
+            <w:tcW w:type="dxa" w:w="2880"/>
+          </w:tcPr>
+          <w:p>
+            <w:r>
+              <w:t>50</w:t>
+            </w:r>
+          </w:p>
+        </w:tc>
+        <w:tc>
+          <w:tcPr>
+            <w:tcW w:type="dxa" w:w="2880"/>
+          </w:tcPr>
+          <w:p>
+            <w:r>
+              <w:t>Topic 3: schedules, connectors, delivery gate</w:t>
+            </w:r>
+          </w:p>
+        </w:tc>
+      </w:tr>
+      <w:tr>
+        <w:tc>
+          <w:tcPr>
+            <w:tcW w:type="dxa" w:w="2880"/>
+          </w:tcPr>
+          <w:p>
+            <w:r>
+              <w:t>16:30–17:55</w:t>
+            </w:r>
+          </w:p>
+        </w:tc>
+        <w:tc>
+          <w:tcPr>
+            <w:tcW w:type="dxa" w:w="2880"/>
+          </w:tcPr>
+          <w:p>
+            <w:r>
+              <w:t>85</w:t>
+            </w:r>
+          </w:p>
+        </w:tc>
+        <w:tc>
+          <w:tcPr>
+            <w:tcW w:type="dxa" w:w="2880"/>
+          </w:tcPr>
+          <w:p>
+            <w:r>
+              <w:t>Lab 3: schedule and Outlook flow</w:t>
+            </w:r>
+          </w:p>
+        </w:tc>
+      </w:tr>
+      <w:tr>
+        <w:tc>
+          <w:tcPr>
+            <w:tcW w:type="dxa" w:w="2880"/>
+          </w:tcPr>
+          <w:p>
+            <w:r>
+              <w:t>17:55–18:00</w:t>
+            </w:r>
+          </w:p>
+        </w:tc>
+        <w:tc>
+          <w:tcPr>
+            <w:tcW w:type="dxa" w:w="2880"/>
+          </w:tcPr>
+          <w:p>
+            <w:r>
+              <w:t>5</w:t>
+            </w:r>
+          </w:p>
+        </w:tc>
+        <w:tc>
+          <w:tcPr>
+            <w:tcW w:type="dxa" w:w="2880"/>
+          </w:tcPr>
+          <w:p>
+            <w:r>
+              <w:t>Reconciliation recap</w:t>
             </w:r>
           </w:p>
         </w:tc>
       </w:tr>
     </w:tbl>
+    <w:p>
+      <w:r>
+        <w:t>Scheduled time excluding lunch: 480 minutes. Instruction: 450 minutes; tea breaks: 30 minutes.</w:t>
+      </w:r>
+    </w:p>
+    <w:p>
+      <w:pPr>
+        <w:pStyle w:val="Heading1"/>
+      </w:pPr>
+      <w:r>
+        <w:t>Trainer evidence and release gates</w:t>
+      </w:r>
+    </w:p>
+    <w:p>
+      <w:pPr>
+        <w:pStyle w:val="ListBullet"/>
+      </w:pPr>
+      <w:r>
+        <w:t>Lab 1: inventory confirms 14 source rows, one duplicate, one pending item; source hash unchanged.</w:t>
+      </w:r>
+    </w:p>
+    <w:p>
+      <w:pPr>
+        <w:pStyle w:val="ListBullet"/>
+      </w:pPr>
+      <w:r>
+        <w:t>Lab 2: August approved revenue S$46,700, expenses S$16,500, net S$30,200; 12 eligible rows.</w:t>
+      </w:r>
+    </w:p>
+    <w:p>
+      <w:pPr>
+        <w:pStyle w:val="ListBullet"/>
+      </w:pPr>
+      <w:r>
+        <w:t>Lab 3: September approved revenue S$48,100, expenses S$16,960, net S$31,140; one approved workbook and one Outlook test email.</w:t>
+      </w:r>
+    </w:p>
+    <w:p>
+      <w:pPr>
+        <w:pStyle w:val="Heading1"/>
+      </w:pPr>
+      <w:r>
+        <w:t>Learning reinforcement</w:t>
+      </w:r>
+    </w:p>
+    <w:p>
+      <w:r>
+        <w:t>Learners compare workbook formulas and independent controls, then use a human gate before the approved report enters the delivery folder. No real finance or recipient data is needed.</w:t>
+      </w:r>
+    </w:p>
     <w:sectPr>
-      <w:footerReference w:type="default" r:id="rId10"/>
       <w:pgSz w:w="12240" w:h="15840"/>
       <w:pgMar w:top="1440" w:right="1800" w:bottom="1440" w:left="1800" w:header="720" w:footer="720" w:gutter="0"/>
       <w:cols w:space="720"/>
@@ -1792,64 +593,6 @@
     </w:sectPr>
   </w:body>
 </w:document>
-</file>
-
-<file path=word/footer1.xml><?xml version="1.0" encoding="utf-8"?>
-<w:ftr xmlns:m="http://schemas.openxmlformats.org/officeDocument/2006/math" xmlns:mc="http://schemas.openxmlformats.org/markup-compatibility/2006" xmlns:mo="http://schemas.microsoft.com/office/mac/office/2008/main" xmlns:mv="urn:schemas-microsoft-com:mac:vml" xmlns:o="urn:schemas-microsoft-com:office:office" xmlns:r="http://schemas.openxmlformats.org/officeDocument/2006/relationships" xmlns:v="urn:schemas-microsoft-com:vml" xmlns:w10="urn:schemas-microsoft-com:office:word" xmlns:w14="http://schemas.microsoft.com/office/word/2010/wordml" xmlns:w="http://schemas.openxmlformats.org/wordprocessingml/2006/main" xmlns:wne="http://schemas.microsoft.com/office/word/2006/wordml" xmlns:wp14="http://schemas.microsoft.com/office/word/2010/wordprocessingDrawing" xmlns:wp="http://schemas.openxmlformats.org/drawingml/2006/wordprocessingDrawing" xmlns:wpc="http://schemas.microsoft.com/office/word/2010/wordprocessingCanvas" xmlns:wpg="http://schemas.microsoft.com/office/word/2010/wordprocessingGroup" xmlns:wpi="http://schemas.microsoft.com/office/word/2010/wordprocessingInk" xmlns:wps="http://schemas.microsoft.com/office/word/2010/wordprocessingShape" mc:Ignorable="w14 wp14">
-  <w:p>
-    <w:pPr>
-      <w:pStyle w:val="Footer"/>
-      <w:jc w:val="center"/>
-    </w:pPr>
-    <w:r/>
-    <w:r>
-      <w:rPr>
-        <w:color w:val="555B66"/>
-        <w:sz w:val="18"/>
-      </w:rPr>
-      <w:t xml:space="preserve">Page </w:t>
-    </w:r>
-    <w:r>
-      <w:rPr>
-        <w:sz w:val="18"/>
-      </w:rPr>
-      <w:fldChar w:fldCharType="begin"/>
-      <w:instrText xml:space="preserve">PAGE</w:instrText>
-      <w:fldChar w:fldCharType="separate"/>
-      <w:t>1</w:t>
-      <w:fldChar w:fldCharType="end"/>
-    </w:r>
-    <w:r>
-      <w:rPr>
-        <w:color w:val="555B66"/>
-        <w:sz w:val="18"/>
-      </w:rPr>
-      <w:t xml:space="preserve"> of </w:t>
-    </w:r>
-    <w:r>
-      <w:rPr>
-        <w:sz w:val="18"/>
-      </w:rPr>
-      <w:fldChar w:fldCharType="begin"/>
-      <w:instrText xml:space="preserve">NUMPAGES</w:instrText>
-      <w:fldChar w:fldCharType="separate"/>
-      <w:t>1</w:t>
-      <w:fldChar w:fldCharType="end"/>
-    </w:r>
-  </w:p>
-  <w:p>
-    <w:pPr>
-      <w:jc w:val="center"/>
-    </w:pPr>
-    <w:r>
-      <w:rPr>
-        <w:color w:val="555B66"/>
-        <w:sz w:val="15"/>
-      </w:rPr>
-      <w:t>© 2026 Tertiary Infotech Academy Pte Ltd. All rights reserved.  ·  www.tertiarycourses.com.sg</w:t>
-    </w:r>
-  </w:p>
-</w:ftr>
 </file>
 
 <file path=word/numbering.xml><?xml version="1.0" encoding="utf-8"?>
@@ -2215,10 +958,6 @@
     <w:name w:val="Normal"/>
     <w:qFormat/>
     <w:rsid w:val="00FC693F"/>
-    <w:rPr>
-      <w:rFonts w:ascii="Arial" w:hAnsi="Arial"/>
-      <w:sz w:val="22"/>
-    </w:rPr>
   </w:style>
   <w:style w:type="paragraph" w:styleId="Header">
     <w:name w:val="header"/>
@@ -2279,11 +1018,11 @@
       <w:outlineLvl w:val="0"/>
     </w:pPr>
     <w:rPr>
-      <w:rFonts w:asciiTheme="majorHAnsi" w:eastAsiaTheme="majorEastAsia" w:hAnsiTheme="majorHAnsi" w:cstheme="majorBidi" w:ascii="Arial" w:hAnsi="Arial"/>
+      <w:rFonts w:asciiTheme="majorHAnsi" w:eastAsiaTheme="majorEastAsia" w:hAnsiTheme="majorHAnsi" w:cstheme="majorBidi"/>
       <w:b/>
       <w:bCs/>
-      <w:color w:val="1F6FEB"/>
-      <w:sz w:val="32"/>
+      <w:color w:val="365F91" w:themeColor="accent1" w:themeShade="BF"/>
+      <w:sz w:val="28"/>
       <w:szCs w:val="28"/>
     </w:rPr>
   </w:style>
@@ -2303,10 +1042,10 @@
       <w:outlineLvl w:val="1"/>
     </w:pPr>
     <w:rPr>
-      <w:rFonts w:asciiTheme="majorHAnsi" w:eastAsiaTheme="majorEastAsia" w:hAnsiTheme="majorHAnsi" w:cstheme="majorBidi" w:ascii="Arial" w:hAnsi="Arial"/>
+      <w:rFonts w:asciiTheme="majorHAnsi" w:eastAsiaTheme="majorEastAsia" w:hAnsiTheme="majorHAnsi" w:cstheme="majorBidi"/>
       <w:b/>
       <w:bCs/>
-      <w:color w:val="111827"/>
+      <w:color w:val="4F81BD" w:themeColor="accent1"/>
       <w:sz w:val="26"/>
       <w:szCs w:val="26"/>
     </w:rPr>
@@ -2327,11 +1066,10 @@
       <w:outlineLvl w:val="2"/>
     </w:pPr>
     <w:rPr>
-      <w:rFonts w:asciiTheme="majorHAnsi" w:eastAsiaTheme="majorEastAsia" w:hAnsiTheme="majorHAnsi" w:cstheme="majorBidi" w:ascii="Arial" w:hAnsi="Arial"/>
+      <w:rFonts w:asciiTheme="majorHAnsi" w:eastAsiaTheme="majorEastAsia" w:hAnsiTheme="majorHAnsi" w:cstheme="majorBidi"/>
       <w:b/>
       <w:bCs/>
-      <w:color w:val="1F6FEB"/>
-      <w:sz w:val="22"/>
+      <w:color w:val="4F81BD" w:themeColor="accent1"/>
     </w:rPr>
   </w:style>
   <w:style w:type="paragraph" w:styleId="Heading4">
@@ -2569,12 +1307,11 @@
       <w:contextualSpacing/>
     </w:pPr>
     <w:rPr>
-      <w:rFonts w:asciiTheme="majorHAnsi" w:eastAsiaTheme="majorEastAsia" w:hAnsiTheme="majorHAnsi" w:cstheme="majorBidi" w:ascii="Arial" w:hAnsi="Arial"/>
-      <w:b/>
-      <w:color w:val="111827"/>
+      <w:rFonts w:asciiTheme="majorHAnsi" w:eastAsiaTheme="majorEastAsia" w:hAnsiTheme="majorHAnsi" w:cstheme="majorBidi"/>
+      <w:color w:val="17365D" w:themeColor="text2" w:themeShade="BF"/>
       <w:spacing w:val="5"/>
       <w:kern w:val="28"/>
-      <w:sz w:val="48"/>
+      <w:sz w:val="52"/>
       <w:szCs w:val="52"/>
     </w:rPr>
   </w:style>

</xml_diff>

<commit_message>
Rebuild as v3.0: Claude Style design, three topics, six Meridian labs
Replace the v2.1 eight-lab finance course with a rebuilt one-day course on
the Claude Style design shared with the Claude Code Masterclass, reusing its
Claude product family and AI evolution slides.

Three topics, six labs, all running on one fictitious company (Meridian
Capital Partners Pte Ltd) so each lab extends the last:

  Topic 1  Claude Cowork Fundamentals  Labs 1-2  Live Artefacts
  Topic 2  Tools and Skills            Labs 3-5  Drive, Gmail, /daily-brief
  Topic 3  Claude Projects             Lab 6     assemble the workspace

Ready-to-paste prompts now appear in the slide deck, Learner Guide and lab
files, and each lab ships in both Markdown and PDF.

The whole course generates from one source (course_data.py + data_domainN.py);
build_mockdata.py asserts the figures the courseware quotes, so the slides and
the CSVs cannot drift apart.

Co-Authored-By: Claude Opus 5 <noreply@anthropic.com>
</commit_message>
<xml_diff>
--- a/courseware/LP-Claude Cowork Masterclass.docx
+++ b/courseware/LP-Claude Cowork Masterclass.docx
@@ -2,31 +2,209 @@
 <file path=word/document.xml><?xml version="1.0" encoding="utf-8"?>
 <w:document xmlns:wpc="http://schemas.microsoft.com/office/word/2010/wordprocessingCanvas" xmlns:mo="http://schemas.microsoft.com/office/mac/office/2008/main" xmlns:mc="http://schemas.openxmlformats.org/markup-compatibility/2006" xmlns:mv="urn:schemas-microsoft-com:mac:vml" xmlns:o="urn:schemas-microsoft-com:office:office" xmlns:r="http://schemas.openxmlformats.org/officeDocument/2006/relationships" xmlns:m="http://schemas.openxmlformats.org/officeDocument/2006/math" xmlns:v="urn:schemas-microsoft-com:vml" xmlns:wp14="http://schemas.microsoft.com/office/word/2010/wordprocessingDrawing" xmlns:wp="http://schemas.openxmlformats.org/drawingml/2006/wordprocessingDrawing" xmlns:w10="urn:schemas-microsoft-com:office:word" xmlns:w="http://schemas.openxmlformats.org/wordprocessingml/2006/main" xmlns:w14="http://schemas.microsoft.com/office/word/2010/wordml" xmlns:wpg="http://schemas.microsoft.com/office/word/2010/wordprocessingGroup" xmlns:wpi="http://schemas.microsoft.com/office/word/2010/wordprocessingInk" xmlns:wne="http://schemas.microsoft.com/office/word/2006/wordml" xmlns:wps="http://schemas.microsoft.com/office/word/2010/wordprocessingShape" mc:Ignorable="w14 wp14">
   <w:body>
+    <w:p/>
     <w:p>
       <w:pPr>
-        <w:pStyle w:val="Title"/>
+        <w:jc w:val="center"/>
       </w:pPr>
       <w:r>
-        <w:t>Lesson Plan — Claude Cowork Masterclass (C1382)</w:t>
+        <w:drawing>
+          <wp:inline xmlns:a="http://schemas.openxmlformats.org/drawingml/2006/main" xmlns:pic="http://schemas.openxmlformats.org/drawingml/2006/picture">
+            <wp:extent cx="1920240" cy="1920240"/>
+            <wp:docPr id="1" name="Picture 1"/>
+            <wp:cNvGraphicFramePr>
+              <a:graphicFrameLocks noChangeAspect="1"/>
+            </wp:cNvGraphicFramePr>
+            <a:graphic>
+              <a:graphicData uri="http://schemas.openxmlformats.org/drawingml/2006/picture">
+                <pic:pic>
+                  <pic:nvPicPr>
+                    <pic:cNvPr id="0" name="tertiary-infotech-logo.png"/>
+                    <pic:cNvPicPr/>
+                  </pic:nvPicPr>
+                  <pic:blipFill>
+                    <a:blip r:embed="rId9"/>
+                    <a:stretch>
+                      <a:fillRect/>
+                    </a:stretch>
+                  </pic:blipFill>
+                  <pic:spPr>
+                    <a:xfrm>
+                      <a:off x="0" y="0"/>
+                      <a:ext cx="1920240" cy="1920240"/>
+                    </a:xfrm>
+                    <a:prstGeom prst="rect"/>
+                  </pic:spPr>
+                </pic:pic>
+              </a:graphicData>
+            </a:graphic>
+          </wp:inline>
+        </w:drawing>
+      </w:r>
+    </w:p>
+    <w:p>
+      <w:pPr>
+        <w:spacing w:before="40" w:after="20"/>
+        <w:jc w:val="center"/>
+      </w:pPr>
+      <w:r>
+        <w:rPr>
+          <w:b/>
+          <w:color w:val="111827"/>
+          <w:sz w:val="26"/>
+        </w:rPr>
+        <w:t>Tertiary Infotech Academy Pte Ltd</w:t>
+      </w:r>
+    </w:p>
+    <w:p>
+      <w:pPr>
+        <w:spacing w:before="0" w:after="200"/>
+        <w:jc w:val="center"/>
+      </w:pPr>
+      <w:r>
+        <w:rPr>
+          <w:b w:val="0"/>
+          <w:color w:val="555B66"/>
+          <w:sz w:val="20"/>
+        </w:rPr>
+        <w:t>UEN: 201200696W</w:t>
+      </w:r>
+    </w:p>
+    <w:p>
+      <w:pPr>
+        <w:spacing w:before="0" w:after="80"/>
+        <w:jc w:val="center"/>
+      </w:pPr>
+      <w:r>
+        <w:rPr>
+          <w:b/>
+          <w:color w:val="1F6FEB"/>
+          <w:sz w:val="52"/>
+        </w:rPr>
+        <w:t>LESSON PLAN</w:t>
+      </w:r>
+    </w:p>
+    <w:p>
+      <w:pPr>
+        <w:spacing w:before="80" w:after="160"/>
+        <w:jc w:val="center"/>
+      </w:pPr>
+      <w:r>
+        <w:rPr>
+          <w:b w:val="0"/>
+          <w:color w:val="555B66"/>
+          <w:sz w:val="24"/>
+        </w:rPr>
+        <w:t>For</w:t>
+      </w:r>
+    </w:p>
+    <w:p>
+      <w:pPr>
+        <w:spacing w:before="80" w:after="40"/>
+        <w:jc w:val="center"/>
+      </w:pPr>
+      <w:r>
+        <w:rPr>
+          <w:b/>
+          <w:color w:val="111827"/>
+          <w:sz w:val="40"/>
+        </w:rPr>
+        <w:t>Claude Cowork Masterclass</w:t>
+      </w:r>
+    </w:p>
+    <w:p>
+      <w:pPr>
+        <w:spacing w:before="80" w:after="280"/>
+        <w:jc w:val="center"/>
+      </w:pPr>
+      <w:r>
+        <w:rPr>
+          <w:b w:val="0"/>
+          <w:color w:val="111827"/>
+          <w:sz w:val="24"/>
+        </w:rPr>
+        <w:t>Course Code: C1382</w:t>
+      </w:r>
+    </w:p>
+    <w:p>
+      <w:pPr>
+        <w:spacing w:before="0" w:after="40"/>
+        <w:jc w:val="center"/>
+      </w:pPr>
+      <w:r>
+        <w:rPr>
+          <w:b w:val="0"/>
+          <w:color w:val="555B66"/>
+          <w:sz w:val="22"/>
+        </w:rPr>
+        <w:t>Conducted by</w:t>
+      </w:r>
+    </w:p>
+    <w:p>
+      <w:pPr>
+        <w:spacing w:before="0" w:after="40"/>
+        <w:jc w:val="center"/>
+      </w:pPr>
+      <w:r>
+        <w:rPr>
+          <w:b/>
+          <w:color w:val="111827"/>
+          <w:sz w:val="26"/>
+        </w:rPr>
+        <w:t>Tertiary Infotech Academy Pte Ltd</w:t>
+      </w:r>
+    </w:p>
+    <w:p>
+      <w:pPr>
+        <w:spacing w:before="0" w:after="240"/>
+        <w:jc w:val="center"/>
+      </w:pPr>
+      <w:r>
+        <w:rPr>
+          <w:b w:val="0"/>
+          <w:color w:val="555B66"/>
+          <w:sz w:val="22"/>
+        </w:rPr>
+        <w:t>UEN: 201200696W</w:t>
+      </w:r>
+    </w:p>
+    <w:p>
+      <w:pPr>
+        <w:spacing w:before="0" w:after="80"/>
+        <w:jc w:val="center"/>
+      </w:pPr>
+      <w:r>
+        <w:rPr>
+          <w:b/>
+          <w:color w:val="1F6FEB"/>
+          <w:sz w:val="24"/>
+        </w:rPr>
+        <w:t>Version 3.0</w:t>
       </w:r>
     </w:p>
     <w:p>
       <w:r>
-        <w:t>v2.1 · 16 September 2026 · One day · 7.5 instructional hours plus 30 minutes tea breaks</w:t>
+        <w:br w:type="page"/>
       </w:r>
     </w:p>
     <w:p>
       <w:pPr>
-        <w:pStyle w:val="Heading1"/>
+        <w:spacing w:after="120"/>
       </w:pPr>
       <w:r>
-        <w:t>Document Version Control Record</w:t>
+        <w:rPr>
+          <w:b/>
+          <w:color w:val="111827"/>
+          <w:sz w:val="24"/>
+        </w:rPr>
+        <w:t>DOCUMENT VERSION CONTROL RECORD</w:t>
       </w:r>
     </w:p>
     <w:tbl>
       <w:tblPr>
         <w:tblStyle w:val="TableGrid"/>
         <w:tblW w:type="auto" w:w="0"/>
+        <w:jc w:val="center"/>
         <w:tblLook w:firstColumn="1" w:firstRow="1" w:lastColumn="0" w:lastRow="0" w:noHBand="0" w:noVBand="1" w:val="04A0"/>
       </w:tblPr>
       <w:tblGrid>
@@ -39,39 +217,67 @@
         <w:tc>
           <w:tcPr>
             <w:tcW w:type="dxa" w:w="2160"/>
+            <w:shd w:val="clear" w:color="auto" w:fill="1F6FEB"/>
           </w:tcPr>
           <w:p>
+            <w:r/>
             <w:r>
-              <w:t>Version</w:t>
+              <w:rPr>
+                <w:b/>
+                <w:color w:val="FFFFFF"/>
+                <w:sz w:val="19"/>
+              </w:rPr>
+              <w:t>Version Number</w:t>
             </w:r>
           </w:p>
         </w:tc>
         <w:tc>
           <w:tcPr>
             <w:tcW w:type="dxa" w:w="2160"/>
+            <w:shd w:val="clear" w:color="auto" w:fill="1F6FEB"/>
           </w:tcPr>
           <w:p>
+            <w:r/>
             <w:r>
-              <w:t>Date</w:t>
+              <w:rPr>
+                <w:b/>
+                <w:color w:val="FFFFFF"/>
+                <w:sz w:val="19"/>
+              </w:rPr>
+              <w:t>Effective Date of Release</w:t>
             </w:r>
           </w:p>
         </w:tc>
         <w:tc>
           <w:tcPr>
             <w:tcW w:type="dxa" w:w="2160"/>
+            <w:shd w:val="clear" w:color="auto" w:fill="1F6FEB"/>
           </w:tcPr>
           <w:p>
+            <w:r/>
             <w:r>
-              <w:t>Change</w:t>
+              <w:rPr>
+                <w:b/>
+                <w:color w:val="FFFFFF"/>
+                <w:sz w:val="19"/>
+              </w:rPr>
+              <w:t>Summary of Included Changes</w:t>
             </w:r>
           </w:p>
         </w:tc>
         <w:tc>
           <w:tcPr>
             <w:tcW w:type="dxa" w:w="2160"/>
+            <w:shd w:val="clear" w:color="auto" w:fill="1F6FEB"/>
           </w:tcPr>
           <w:p>
+            <w:r/>
             <w:r>
+              <w:rPr>
+                <w:b/>
+                <w:color w:val="FFFFFF"/>
+                <w:sz w:val="19"/>
+              </w:rPr>
               <w:t>Author</w:t>
             </w:r>
           </w:p>
@@ -83,7 +289,127 @@
             <w:tcW w:type="dxa" w:w="2160"/>
           </w:tcPr>
           <w:p>
+            <w:r/>
             <w:r>
+              <w:rPr>
+                <w:sz w:val="19"/>
+              </w:rPr>
+              <w:t>1.0</w:t>
+            </w:r>
+          </w:p>
+        </w:tc>
+        <w:tc>
+          <w:tcPr>
+            <w:tcW w:type="dxa" w:w="2160"/>
+          </w:tcPr>
+          <w:p>
+            <w:r/>
+            <w:r>
+              <w:rPr>
+                <w:sz w:val="19"/>
+              </w:rPr>
+              <w:t>15 September 2026</w:t>
+            </w:r>
+          </w:p>
+        </w:tc>
+        <w:tc>
+          <w:tcPr>
+            <w:tcW w:type="dxa" w:w="2160"/>
+          </w:tcPr>
+          <w:p>
+            <w:r/>
+            <w:r>
+              <w:rPr>
+                <w:sz w:val="19"/>
+              </w:rPr>
+              <w:t>Initial release.</w:t>
+            </w:r>
+          </w:p>
+        </w:tc>
+        <w:tc>
+          <w:tcPr>
+            <w:tcW w:type="dxa" w:w="2160"/>
+          </w:tcPr>
+          <w:p>
+            <w:r/>
+            <w:r>
+              <w:rPr>
+                <w:sz w:val="19"/>
+              </w:rPr>
+              <w:t>Dr. Alfred Ang</w:t>
+            </w:r>
+          </w:p>
+        </w:tc>
+      </w:tr>
+      <w:tr>
+        <w:tc>
+          <w:tcPr>
+            <w:tcW w:type="dxa" w:w="2160"/>
+          </w:tcPr>
+          <w:p>
+            <w:r/>
+            <w:r>
+              <w:rPr>
+                <w:sz w:val="19"/>
+              </w:rPr>
+              <w:t>2.0</w:t>
+            </w:r>
+          </w:p>
+        </w:tc>
+        <w:tc>
+          <w:tcPr>
+            <w:tcW w:type="dxa" w:w="2160"/>
+          </w:tcPr>
+          <w:p>
+            <w:r/>
+            <w:r>
+              <w:rPr>
+                <w:sz w:val="19"/>
+              </w:rPr>
+              <w:t>15 September 2026</w:t>
+            </w:r>
+          </w:p>
+        </w:tc>
+        <w:tc>
+          <w:tcPr>
+            <w:tcW w:type="dxa" w:w="2160"/>
+          </w:tcPr>
+          <w:p>
+            <w:r/>
+            <w:r>
+              <w:rPr>
+                <w:sz w:val="19"/>
+              </w:rPr>
+              <w:t>Finance task automation scenarios.</w:t>
+            </w:r>
+          </w:p>
+        </w:tc>
+        <w:tc>
+          <w:tcPr>
+            <w:tcW w:type="dxa" w:w="2160"/>
+          </w:tcPr>
+          <w:p>
+            <w:r/>
+            <w:r>
+              <w:rPr>
+                <w:sz w:val="19"/>
+              </w:rPr>
+              <w:t>Dr. Alfred Ang</w:t>
+            </w:r>
+          </w:p>
+        </w:tc>
+      </w:tr>
+      <w:tr>
+        <w:tc>
+          <w:tcPr>
+            <w:tcW w:type="dxa" w:w="2160"/>
+          </w:tcPr>
+          <w:p>
+            <w:r/>
+            <w:r>
+              <w:rPr>
+                <w:sz w:val="19"/>
+              </w:rPr>
               <w:t>2.1</w:t>
             </w:r>
           </w:p>
@@ -93,7 +419,11 @@
             <w:tcW w:type="dxa" w:w="2160"/>
           </w:tcPr>
           <w:p>
+            <w:r/>
             <w:r>
+              <w:rPr>
+                <w:sz w:val="19"/>
+              </w:rPr>
               <w:t>16 September 2026</w:t>
             </w:r>
           </w:p>
@@ -103,8 +433,12 @@
             <w:tcW w:type="dxa" w:w="2160"/>
           </w:tcPr>
           <w:p>
+            <w:r/>
             <w:r>
-              <w:t>Simplified eight-use-case automation course with visual slides and self-contained labs</w:t>
+              <w:rPr>
+                <w:sz w:val="19"/>
+              </w:rPr>
+              <w:t>Eight finance labs with mock data and skills.</w:t>
             </w:r>
           </w:p>
         </w:tc>
@@ -113,8 +447,451 @@
             <w:tcW w:type="dxa" w:w="2160"/>
           </w:tcPr>
           <w:p>
+            <w:r/>
             <w:r>
-              <w:t>Tertiary Infotech Academy</w:t>
+              <w:rPr>
+                <w:sz w:val="19"/>
+              </w:rPr>
+              <w:t>Dr. Alfred Ang</w:t>
+            </w:r>
+          </w:p>
+        </w:tc>
+      </w:tr>
+      <w:tr>
+        <w:tc>
+          <w:tcPr>
+            <w:tcW w:type="dxa" w:w="2160"/>
+          </w:tcPr>
+          <w:p>
+            <w:r/>
+            <w:r>
+              <w:rPr>
+                <w:sz w:val="19"/>
+              </w:rPr>
+              <w:t>3.0</w:t>
+            </w:r>
+          </w:p>
+        </w:tc>
+        <w:tc>
+          <w:tcPr>
+            <w:tcW w:type="dxa" w:w="2160"/>
+          </w:tcPr>
+          <w:p>
+            <w:r/>
+            <w:r>
+              <w:rPr>
+                <w:sz w:val="19"/>
+              </w:rPr>
+              <w:t>16 September 2026</w:t>
+            </w:r>
+          </w:p>
+        </w:tc>
+        <w:tc>
+          <w:tcPr>
+            <w:tcW w:type="dxa" w:w="2160"/>
+          </w:tcPr>
+          <w:p>
+            <w:r/>
+            <w:r>
+              <w:rPr>
+                <w:sz w:val="19"/>
+              </w:rPr>
+              <w:t>Rebuilt on the Claude Style design shared with the Claude Code Masterclass, reusing its Claude product family and AI evolution slides. Replaced the eight finance labs with three topics — Cowork Fundamentals (Live Artefacts), Tools and Skills (Google Drive and Gmail connectors plus a reusable daily-brief automation) and Claude Projects (assembling everything into one shared workspace) — delivered as six coherent labs on one fictitious company, Meridian Capital Partners Pte Ltd. Ready-to-paste prompts added to the slides, Learner Guide and labs, and each lab is now issued in both Markdown and PDF.</w:t>
+            </w:r>
+          </w:p>
+        </w:tc>
+        <w:tc>
+          <w:tcPr>
+            <w:tcW w:type="dxa" w:w="2160"/>
+          </w:tcPr>
+          <w:p>
+            <w:r/>
+            <w:r>
+              <w:rPr>
+                <w:sz w:val="19"/>
+              </w:rPr>
+              <w:t>Dr. Alfred Ang</w:t>
+            </w:r>
+          </w:p>
+        </w:tc>
+      </w:tr>
+    </w:tbl>
+    <w:p>
+      <w:r>
+        <w:br w:type="page"/>
+      </w:r>
+    </w:p>
+    <w:p>
+      <w:pPr>
+        <w:spacing w:after="120"/>
+      </w:pPr>
+      <w:r>
+        <w:rPr>
+          <w:b/>
+          <w:color w:val="111827"/>
+          <w:sz w:val="24"/>
+        </w:rPr>
+        <w:t>TABLE OF CONTENTS</w:t>
+      </w:r>
+    </w:p>
+    <w:p>
+      <w:pPr>
+        <w:tabs>
+          <w:tab w:pos="9072" w:val="right" w:leader="dot"/>
+        </w:tabs>
+        <w:spacing w:after="60"/>
+      </w:pPr>
+      <w:r>
+        <w:rPr>
+          <w:rFonts w:ascii="Arial" w:hAnsi="Arial"/>
+          <w:b/>
+          <w:color w:val="333333"/>
+          <w:sz w:val="22"/>
+        </w:rPr>
+        <w:t>Course Information</w:t>
+        <w:tab/>
+        <w:t>4</w:t>
+      </w:r>
+    </w:p>
+    <w:p>
+      <w:pPr>
+        <w:tabs>
+          <w:tab w:pos="9072" w:val="right" w:leader="dot"/>
+        </w:tabs>
+        <w:spacing w:after="60"/>
+      </w:pPr>
+      <w:r>
+        <w:rPr>
+          <w:rFonts w:ascii="Arial" w:hAnsi="Arial"/>
+          <w:b/>
+          <w:color w:val="333333"/>
+          <w:sz w:val="22"/>
+        </w:rPr>
+        <w:t>Learning Outcomes</w:t>
+        <w:tab/>
+        <w:t>4</w:t>
+      </w:r>
+    </w:p>
+    <w:p>
+      <w:pPr>
+        <w:tabs>
+          <w:tab w:pos="9072" w:val="right" w:leader="dot"/>
+        </w:tabs>
+        <w:spacing w:after="60"/>
+      </w:pPr>
+      <w:r>
+        <w:rPr>
+          <w:rFonts w:ascii="Arial" w:hAnsi="Arial"/>
+          <w:b/>
+          <w:color w:val="333333"/>
+          <w:sz w:val="22"/>
+        </w:rPr>
+        <w:t>Learning Reinforcement</w:t>
+        <w:tab/>
+        <w:t>4</w:t>
+      </w:r>
+    </w:p>
+    <w:p>
+      <w:pPr>
+        <w:tabs>
+          <w:tab w:pos="9072" w:val="right" w:leader="dot"/>
+        </w:tabs>
+        <w:spacing w:after="60"/>
+      </w:pPr>
+      <w:r>
+        <w:rPr>
+          <w:rFonts w:ascii="Arial" w:hAnsi="Arial"/>
+          <w:b/>
+          <w:color w:val="333333"/>
+          <w:sz w:val="22"/>
+        </w:rPr>
+        <w:t>Course Schedule</w:t>
+        <w:tab/>
+        <w:t>4</w:t>
+      </w:r>
+    </w:p>
+    <w:p>
+      <w:pPr>
+        <w:tabs>
+          <w:tab w:pos="9072" w:val="right" w:leader="dot"/>
+        </w:tabs>
+        <w:spacing w:after="60"/>
+        <w:ind w:left="432"/>
+      </w:pPr>
+      <w:r>
+        <w:rPr>
+          <w:rFonts w:ascii="Arial" w:hAnsi="Arial"/>
+          <w:b w:val="0"/>
+          <w:color w:val="333333"/>
+          <w:sz w:val="21"/>
+        </w:rPr>
+        <w:t>Day 1 — From a first Live Artefact to a branded, connected finance dashboard</w:t>
+        <w:tab/>
+        <w:t>4</w:t>
+      </w:r>
+    </w:p>
+    <w:p>
+      <w:pPr>
+        <w:tabs>
+          <w:tab w:pos="9072" w:val="right" w:leader="dot"/>
+        </w:tabs>
+        <w:spacing w:after="60"/>
+      </w:pPr>
+      <w:r>
+        <w:rPr>
+          <w:rFonts w:ascii="Arial" w:hAnsi="Arial"/>
+          <w:b/>
+          <w:color w:val="333333"/>
+          <w:sz w:val="22"/>
+        </w:rPr>
+        <w:t>Lab Reference (aligned to course topics)</w:t>
+        <w:tab/>
+        <w:t>5</w:t>
+      </w:r>
+    </w:p>
+    <w:p>
+      <w:r>
+        <w:br w:type="page"/>
+      </w:r>
+    </w:p>
+    <w:p>
+      <w:pPr>
+        <w:pStyle w:val="Heading1"/>
+      </w:pPr>
+      <w:r>
+        <w:t>Course Information</w:t>
+      </w:r>
+    </w:p>
+    <w:tbl>
+      <w:tblPr>
+        <w:tblStyle w:val="TableGrid"/>
+        <w:tblW w:type="auto" w:w="0"/>
+        <w:tblLook w:firstColumn="1" w:firstRow="1" w:lastColumn="0" w:lastRow="0" w:noHBand="0" w:noVBand="1" w:val="04A0"/>
+      </w:tblPr>
+      <w:tblGrid>
+        <w:gridCol w:w="4320"/>
+        <w:gridCol w:w="4320"/>
+      </w:tblGrid>
+      <w:tr>
+        <w:tc>
+          <w:tcPr>
+            <w:tcW w:type="dxa" w:w="4320"/>
+            <w:shd w:val="clear" w:color="auto" w:fill="E8F0FE"/>
+          </w:tcPr>
+          <w:p>
+            <w:r/>
+            <w:r>
+              <w:rPr>
+                <w:b/>
+                <w:sz w:val="20"/>
+              </w:rPr>
+              <w:t>Course Title</w:t>
+            </w:r>
+          </w:p>
+        </w:tc>
+        <w:tc>
+          <w:tcPr>
+            <w:tcW w:type="dxa" w:w="4320"/>
+          </w:tcPr>
+          <w:p>
+            <w:r/>
+            <w:r>
+              <w:rPr>
+                <w:sz w:val="20"/>
+              </w:rPr>
+              <w:t>Claude Cowork Masterclass</w:t>
+            </w:r>
+          </w:p>
+        </w:tc>
+      </w:tr>
+      <w:tr>
+        <w:tc>
+          <w:tcPr>
+            <w:tcW w:type="dxa" w:w="4320"/>
+            <w:shd w:val="clear" w:color="auto" w:fill="E8F0FE"/>
+          </w:tcPr>
+          <w:p>
+            <w:r/>
+            <w:r>
+              <w:rPr>
+                <w:b/>
+                <w:sz w:val="20"/>
+              </w:rPr>
+              <w:t>Course Reference</w:t>
+            </w:r>
+          </w:p>
+        </w:tc>
+        <w:tc>
+          <w:tcPr>
+            <w:tcW w:type="dxa" w:w="4320"/>
+          </w:tcPr>
+          <w:p>
+            <w:r/>
+            <w:r>
+              <w:rPr>
+                <w:sz w:val="20"/>
+              </w:rPr>
+              <w:t>C1382</w:t>
+            </w:r>
+          </w:p>
+        </w:tc>
+      </w:tr>
+      <w:tr>
+        <w:tc>
+          <w:tcPr>
+            <w:tcW w:type="dxa" w:w="4320"/>
+            <w:shd w:val="clear" w:color="auto" w:fill="E8F0FE"/>
+          </w:tcPr>
+          <w:p>
+            <w:r/>
+            <w:r>
+              <w:rPr>
+                <w:b/>
+                <w:sz w:val="20"/>
+              </w:rPr>
+              <w:t>Training Provider</w:t>
+            </w:r>
+          </w:p>
+        </w:tc>
+        <w:tc>
+          <w:tcPr>
+            <w:tcW w:type="dxa" w:w="4320"/>
+          </w:tcPr>
+          <w:p>
+            <w:r/>
+            <w:r>
+              <w:rPr>
+                <w:sz w:val="20"/>
+              </w:rPr>
+              <w:t>Tertiary Infotech Academy Pte Ltd  (UEN 201200696W)</w:t>
+            </w:r>
+          </w:p>
+        </w:tc>
+      </w:tr>
+      <w:tr>
+        <w:tc>
+          <w:tcPr>
+            <w:tcW w:type="dxa" w:w="4320"/>
+            <w:shd w:val="clear" w:color="auto" w:fill="E8F0FE"/>
+          </w:tcPr>
+          <w:p>
+            <w:r/>
+            <w:r>
+              <w:rPr>
+                <w:b/>
+                <w:sz w:val="20"/>
+              </w:rPr>
+              <w:t>Duration</w:t>
+            </w:r>
+          </w:p>
+        </w:tc>
+        <w:tc>
+          <w:tcPr>
+            <w:tcW w:type="dxa" w:w="4320"/>
+          </w:tcPr>
+          <w:p>
+            <w:r/>
+            <w:r>
+              <w:rPr>
+                <w:sz w:val="20"/>
+              </w:rPr>
+              <w:t>1 day · 7.5 instructional hours per day (7.5 hours)</w:t>
+            </w:r>
+          </w:p>
+        </w:tc>
+      </w:tr>
+      <w:tr>
+        <w:tc>
+          <w:tcPr>
+            <w:tcW w:type="dxa" w:w="4320"/>
+            <w:shd w:val="clear" w:color="auto" w:fill="E8F0FE"/>
+          </w:tcPr>
+          <w:p>
+            <w:r/>
+            <w:r>
+              <w:rPr>
+                <w:b/>
+                <w:sz w:val="20"/>
+              </w:rPr>
+              <w:t>Daily Timing</w:t>
+            </w:r>
+          </w:p>
+        </w:tc>
+        <w:tc>
+          <w:tcPr>
+            <w:tcW w:type="dxa" w:w="4320"/>
+          </w:tcPr>
+          <w:p>
+            <w:r/>
+            <w:r>
+              <w:rPr>
+                <w:sz w:val="20"/>
+              </w:rPr>
+              <w:t>9:00 am – 6:00 pm (1-hour lunch; tea breaks within training time)</w:t>
+            </w:r>
+          </w:p>
+        </w:tc>
+      </w:tr>
+      <w:tr>
+        <w:tc>
+          <w:tcPr>
+            <w:tcW w:type="dxa" w:w="4320"/>
+            <w:shd w:val="clear" w:color="auto" w:fill="E8F0FE"/>
+          </w:tcPr>
+          <w:p>
+            <w:r/>
+            <w:r>
+              <w:rPr>
+                <w:b/>
+                <w:sz w:val="20"/>
+              </w:rPr>
+              <w:t>Mode</w:t>
+            </w:r>
+          </w:p>
+        </w:tc>
+        <w:tc>
+          <w:tcPr>
+            <w:tcW w:type="dxa" w:w="4320"/>
+          </w:tcPr>
+          <w:p>
+            <w:r/>
+            <w:r>
+              <w:rPr>
+                <w:sz w:val="20"/>
+              </w:rPr>
+              <w:t>Instructor-led, hands-on practical labs</w:t>
+            </w:r>
+          </w:p>
+        </w:tc>
+      </w:tr>
+      <w:tr>
+        <w:tc>
+          <w:tcPr>
+            <w:tcW w:type="dxa" w:w="4320"/>
+            <w:shd w:val="clear" w:color="auto" w:fill="E8F0FE"/>
+          </w:tcPr>
+          <w:p>
+            <w:r/>
+            <w:r>
+              <w:rPr>
+                <w:b/>
+                <w:sz w:val="20"/>
+              </w:rPr>
+              <w:t>Trainer</w:t>
+            </w:r>
+          </w:p>
+        </w:tc>
+        <w:tc>
+          <w:tcPr>
+            <w:tcW w:type="dxa" w:w="4320"/>
+          </w:tcPr>
+          <w:p>
+            <w:r/>
+            <w:r>
+              <w:rPr>
+                <w:sz w:val="20"/>
+              </w:rPr>
+              <w:t>Dr. Alfred Ang</w:t>
             </w:r>
           </w:p>
         </w:tc>
@@ -125,7 +902,12 @@
         <w:pStyle w:val="Heading1"/>
       </w:pPr>
       <w:r>
-        <w:t>Learning outcomes</w:t>
+        <w:t>Learning Outcomes</w:t>
+      </w:r>
+    </w:p>
+    <w:p>
+      <w:r>
+        <w:t>On completion of this course, learners will be able to:</w:t>
       </w:r>
     </w:p>
     <w:p>
@@ -133,7 +915,10 @@
         <w:pStyle w:val="ListBullet"/>
       </w:pPr>
       <w:r>
-        <w:t>Set up a Cowork project with a dedicated folder, task instructions and reusable skills.</w:t>
+        <w:rPr>
+          <w:sz w:val="21"/>
+        </w:rPr>
+        <w:t>LO1: Set up Claude and the Cowork desktop workspace, and explain where Cowork fits in the Claude product family.</w:t>
       </w:r>
     </w:p>
     <w:p>
@@ -141,7 +926,10 @@
         <w:pStyle w:val="ListBullet"/>
       </w:pPr>
       <w:r>
-        <w:t>Refresh Excel data and visualisations from the latest dated finance file.</w:t>
+        <w:rPr>
+          <w:sz w:val="21"/>
+        </w:rPr>
+        <w:t>LO2: Build, save and download a Live Artefact, including an interactive sales dashboard from supplied data.</w:t>
       </w:r>
     </w:p>
     <w:p>
@@ -149,7 +937,10 @@
         <w:pStyle w:val="ListBullet"/>
       </w:pPr>
       <w:r>
-        <w:t>Research recent AI-in-finance news and compile a sourced Excel tracker.</w:t>
+        <w:rPr>
+          <w:sz w:val="21"/>
+        </w:rPr>
+        <w:t>LO3: Connect the Google Drive connector so Claude can read finance data held outside the chat.</w:t>
       </w:r>
     </w:p>
     <w:p>
@@ -157,7 +948,10 @@
         <w:pStyle w:val="ListBullet"/>
       </w:pPr>
       <w:r>
-        <w:t>Turn finance files into presentations, trackers, commentary and monitored routines.</w:t>
+        <w:rPr>
+          <w:sz w:val="21"/>
+        </w:rPr>
+        <w:t>LO4: Refresh a Live Artefact from connected data and send an approved summary with the Gmail connector.</w:t>
       </w:r>
     </w:p>
     <w:p>
@@ -165,7 +959,21 @@
         <w:pStyle w:val="ListBullet"/>
       </w:pPr>
       <w:r>
-        <w:t>Rehearse a scheduled finance briefing while keeping email and activation behind human review.</w:t>
+        <w:rPr>
+          <w:sz w:val="21"/>
+        </w:rPr>
+        <w:t>LO5: Write an Agent Skill that runs a repeatable routine across your connected tools on one command.</w:t>
+      </w:r>
+    </w:p>
+    <w:p>
+      <w:pPr>
+        <w:pStyle w:val="ListBullet"/>
+      </w:pPr>
+      <w:r>
+        <w:rPr>
+          <w:sz w:val="21"/>
+        </w:rPr>
+        <w:t>LO6: Assemble a Claude Project that holds the data, instructions, skill and dashboard as one reusable team workspace.</w:t>
       </w:r>
     </w:p>
     <w:p>
@@ -173,7 +981,67 @@
         <w:pStyle w:val="Heading1"/>
       </w:pPr>
       <w:r>
-        <w:t>Course schedule</w:t>
+        <w:t>Learning Reinforcement</w:t>
+      </w:r>
+    </w:p>
+    <w:p>
+      <w:pPr>
+        <w:pStyle w:val="ListBullet"/>
+      </w:pPr>
+      <w:r>
+        <w:rPr>
+          <w:sz w:val="21"/>
+        </w:rPr>
+        <w:t>Every topic is followed by hands-on labs that learners complete on their own machine.</w:t>
+      </w:r>
+    </w:p>
+    <w:p>
+      <w:pPr>
+        <w:pStyle w:val="ListBullet"/>
+      </w:pPr>
+      <w:r>
+        <w:rPr>
+          <w:sz w:val="21"/>
+        </w:rPr>
+        <w:t>Each lab ends with a 'Test it' verification step so learners can confirm their own progress.</w:t>
+      </w:r>
+    </w:p>
+    <w:p>
+      <w:pPr>
+        <w:pStyle w:val="ListBullet"/>
+      </w:pPr>
+      <w:r>
+        <w:rPr>
+          <w:sz w:val="21"/>
+        </w:rPr>
+        <w:t>The trainer circulates during lab time to give individual feedback and unblock learners.</w:t>
+      </w:r>
+    </w:p>
+    <w:p>
+      <w:pPr>
+        <w:pStyle w:val="ListBullet"/>
+      </w:pPr>
+      <w:r>
+        <w:rPr>
+          <w:sz w:val="21"/>
+        </w:rPr>
+        <w:t>Each topic closes with a recap mapped back to the course learning outcomes.</w:t>
+      </w:r>
+    </w:p>
+    <w:p>
+      <w:pPr>
+        <w:pStyle w:val="Heading1"/>
+      </w:pPr>
+      <w:r>
+        <w:t>Course Schedule</w:t>
+      </w:r>
+    </w:p>
+    <w:p>
+      <w:pPr>
+        <w:pStyle w:val="Heading2"/>
+      </w:pPr>
+      <w:r>
+        <w:t>Day 1 — From a first Live Artefact to a branded, connected finance dashboard</w:t>
       </w:r>
     </w:p>
     <w:tbl>
@@ -191,11 +1059,907 @@
       <w:tr>
         <w:tc>
           <w:tcPr>
-            <w:tcW w:type="dxa" w:w="2880"/>
+            <w:tcW w:type="dxa" w:w="1656"/>
+            <w:shd w:val="clear" w:color="auto" w:fill="1F6FEB"/>
           </w:tcPr>
           <w:p>
+            <w:r/>
             <w:r>
+              <w:rPr>
+                <w:rFonts w:ascii="Arial" w:hAnsi="Arial"/>
+                <w:b/>
+                <w:color w:val="FFFFFF"/>
+                <w:sz w:val="20"/>
+              </w:rPr>
               <w:t>Time</w:t>
+            </w:r>
+          </w:p>
+        </w:tc>
+        <w:tc>
+          <w:tcPr>
+            <w:tcW w:type="dxa" w:w="1296"/>
+            <w:shd w:val="clear" w:color="auto" w:fill="1F6FEB"/>
+          </w:tcPr>
+          <w:p>
+            <w:r/>
+            <w:r>
+              <w:rPr>
+                <w:rFonts w:ascii="Arial" w:hAnsi="Arial"/>
+                <w:b/>
+                <w:color w:val="FFFFFF"/>
+                <w:sz w:val="20"/>
+              </w:rPr>
+              <w:t>Duration</w:t>
+            </w:r>
+          </w:p>
+        </w:tc>
+        <w:tc>
+          <w:tcPr>
+            <w:tcW w:type="dxa" w:w="6840"/>
+            <w:shd w:val="clear" w:color="auto" w:fill="1F6FEB"/>
+          </w:tcPr>
+          <w:p>
+            <w:r/>
+            <w:r>
+              <w:rPr>
+                <w:rFonts w:ascii="Arial" w:hAnsi="Arial"/>
+                <w:b/>
+                <w:color w:val="FFFFFF"/>
+                <w:sz w:val="20"/>
+              </w:rPr>
+              <w:t>Topic / Activity</w:t>
+            </w:r>
+          </w:p>
+        </w:tc>
+      </w:tr>
+      <w:tr>
+        <w:tc>
+          <w:tcPr>
+            <w:tcW w:type="dxa" w:w="1656"/>
+            <w:shd w:val="clear" w:color="auto" w:fill="F3F5F8"/>
+          </w:tcPr>
+          <w:p>
+            <w:r/>
+            <w:r>
+              <w:rPr>
+                <w:rFonts w:ascii="Arial" w:hAnsi="Arial"/>
+                <w:b w:val="0"/>
+                <w:sz w:val="19"/>
+              </w:rPr>
+              <w:t>9:00–9:20</w:t>
+            </w:r>
+          </w:p>
+        </w:tc>
+        <w:tc>
+          <w:tcPr>
+            <w:tcW w:type="dxa" w:w="1296"/>
+            <w:shd w:val="clear" w:color="auto" w:fill="F3F5F8"/>
+          </w:tcPr>
+          <w:p>
+            <w:r/>
+            <w:r>
+              <w:rPr>
+                <w:rFonts w:ascii="Arial" w:hAnsi="Arial"/>
+                <w:b w:val="0"/>
+                <w:sz w:val="19"/>
+              </w:rPr>
+              <w:t>20 min</w:t>
+            </w:r>
+          </w:p>
+        </w:tc>
+        <w:tc>
+          <w:tcPr>
+            <w:tcW w:type="dxa" w:w="6840"/>
+            <w:shd w:val="clear" w:color="auto" w:fill="F3F5F8"/>
+          </w:tcPr>
+          <w:p>
+            <w:r/>
+            <w:r>
+              <w:rPr>
+                <w:rFonts w:ascii="Arial" w:hAnsi="Arial"/>
+                <w:b w:val="0"/>
+                <w:sz w:val="19"/>
+              </w:rPr>
+              <w:t>Welcome, introductions and ground rules</w:t>
+            </w:r>
+          </w:p>
+        </w:tc>
+      </w:tr>
+      <w:tr>
+        <w:tc>
+          <w:tcPr>
+            <w:tcW w:type="dxa" w:w="1656"/>
+            <w:shd w:val="clear" w:color="auto" w:fill="E8F0FE"/>
+          </w:tcPr>
+          <w:p>
+            <w:r/>
+            <w:r>
+              <w:rPr>
+                <w:rFonts w:ascii="Arial" w:hAnsi="Arial"/>
+                <w:b/>
+                <w:sz w:val="19"/>
+              </w:rPr>
+              <w:t>9:20–10:05</w:t>
+            </w:r>
+          </w:p>
+        </w:tc>
+        <w:tc>
+          <w:tcPr>
+            <w:tcW w:type="dxa" w:w="1296"/>
+            <w:shd w:val="clear" w:color="auto" w:fill="E8F0FE"/>
+          </w:tcPr>
+          <w:p>
+            <w:r/>
+            <w:r>
+              <w:rPr>
+                <w:rFonts w:ascii="Arial" w:hAnsi="Arial"/>
+                <w:b w:val="0"/>
+                <w:sz w:val="19"/>
+              </w:rPr>
+              <w:t>45 min</w:t>
+            </w:r>
+          </w:p>
+        </w:tc>
+        <w:tc>
+          <w:tcPr>
+            <w:tcW w:type="dxa" w:w="6840"/>
+            <w:shd w:val="clear" w:color="auto" w:fill="E8F0FE"/>
+          </w:tcPr>
+          <w:p>
+            <w:r/>
+            <w:r>
+              <w:rPr>
+                <w:rFonts w:ascii="Arial" w:hAnsi="Arial"/>
+                <w:b/>
+                <w:sz w:val="19"/>
+              </w:rPr>
+              <w:t>Topic 1 — Claude Cowork Fundamentals: the Claude family, the evolution of AI engineering, setting up Cowork</w:t>
+            </w:r>
+          </w:p>
+        </w:tc>
+      </w:tr>
+      <w:tr>
+        <w:tc>
+          <w:tcPr>
+            <w:tcW w:type="dxa" w:w="1656"/>
+            <w:shd w:val="clear" w:color="auto" w:fill="E8F0FE"/>
+          </w:tcPr>
+          <w:p>
+            <w:r/>
+            <w:r>
+              <w:rPr>
+                <w:rFonts w:ascii="Arial" w:hAnsi="Arial"/>
+                <w:b/>
+                <w:sz w:val="19"/>
+              </w:rPr>
+              <w:t>10:05–10:45</w:t>
+            </w:r>
+          </w:p>
+        </w:tc>
+        <w:tc>
+          <w:tcPr>
+            <w:tcW w:type="dxa" w:w="1296"/>
+            <w:shd w:val="clear" w:color="auto" w:fill="E8F0FE"/>
+          </w:tcPr>
+          <w:p>
+            <w:r/>
+            <w:r>
+              <w:rPr>
+                <w:rFonts w:ascii="Arial" w:hAnsi="Arial"/>
+                <w:b w:val="0"/>
+                <w:sz w:val="19"/>
+              </w:rPr>
+              <w:t>40 min</w:t>
+            </w:r>
+          </w:p>
+        </w:tc>
+        <w:tc>
+          <w:tcPr>
+            <w:tcW w:type="dxa" w:w="6840"/>
+            <w:shd w:val="clear" w:color="auto" w:fill="E8F0FE"/>
+          </w:tcPr>
+          <w:p>
+            <w:r/>
+            <w:r>
+              <w:rPr>
+                <w:rFonts w:ascii="Arial" w:hAnsi="Arial"/>
+                <w:b/>
+                <w:sz w:val="19"/>
+              </w:rPr>
+              <w:t>Topic 1 — Live Artefacts: what they are, how they persist, saving and downloading (trainer demo)</w:t>
+            </w:r>
+          </w:p>
+        </w:tc>
+      </w:tr>
+      <w:tr>
+        <w:tc>
+          <w:tcPr>
+            <w:tcW w:type="dxa" w:w="1656"/>
+            <w:shd w:val="clear" w:color="auto" w:fill="FFF4E5"/>
+          </w:tcPr>
+          <w:p>
+            <w:r/>
+            <w:r>
+              <w:rPr>
+                <w:rFonts w:ascii="Arial" w:hAnsi="Arial"/>
+                <w:b w:val="0"/>
+                <w:sz w:val="19"/>
+              </w:rPr>
+              <w:t>10:45–11:00</w:t>
+            </w:r>
+          </w:p>
+        </w:tc>
+        <w:tc>
+          <w:tcPr>
+            <w:tcW w:type="dxa" w:w="1296"/>
+            <w:shd w:val="clear" w:color="auto" w:fill="FFF4E5"/>
+          </w:tcPr>
+          <w:p>
+            <w:r/>
+            <w:r>
+              <w:rPr>
+                <w:rFonts w:ascii="Arial" w:hAnsi="Arial"/>
+                <w:b w:val="0"/>
+                <w:sz w:val="19"/>
+              </w:rPr>
+              <w:t>15 min</w:t>
+            </w:r>
+          </w:p>
+        </w:tc>
+        <w:tc>
+          <w:tcPr>
+            <w:tcW w:type="dxa" w:w="6840"/>
+            <w:shd w:val="clear" w:color="auto" w:fill="FFF4E5"/>
+          </w:tcPr>
+          <w:p>
+            <w:r/>
+            <w:r>
+              <w:rPr>
+                <w:rFonts w:ascii="Arial" w:hAnsi="Arial"/>
+                <w:b w:val="0"/>
+                <w:sz w:val="19"/>
+              </w:rPr>
+              <w:t>Tea break</w:t>
+            </w:r>
+          </w:p>
+        </w:tc>
+      </w:tr>
+      <w:tr>
+        <w:tc>
+          <w:tcPr>
+            <w:tcW w:type="dxa" w:w="1656"/>
+          </w:tcPr>
+          <w:p>
+            <w:r/>
+            <w:r>
+              <w:rPr>
+                <w:rFonts w:ascii="Arial" w:hAnsi="Arial"/>
+                <w:b w:val="0"/>
+                <w:sz w:val="19"/>
+              </w:rPr>
+              <w:t>11:00–12:30</w:t>
+            </w:r>
+          </w:p>
+        </w:tc>
+        <w:tc>
+          <w:tcPr>
+            <w:tcW w:type="dxa" w:w="1296"/>
+          </w:tcPr>
+          <w:p>
+            <w:r/>
+            <w:r>
+              <w:rPr>
+                <w:rFonts w:ascii="Arial" w:hAnsi="Arial"/>
+                <w:b w:val="0"/>
+                <w:sz w:val="19"/>
+              </w:rPr>
+              <w:t>90 min</w:t>
+            </w:r>
+          </w:p>
+        </w:tc>
+        <w:tc>
+          <w:tcPr>
+            <w:tcW w:type="dxa" w:w="6840"/>
+          </w:tcPr>
+          <w:p>
+            <w:r/>
+            <w:r>
+              <w:rPr>
+                <w:rFonts w:ascii="Arial" w:hAnsi="Arial"/>
+                <w:b w:val="0"/>
+                <w:sz w:val="19"/>
+              </w:rPr>
+              <w:t>Hands-on: Lab 1: Your First Live Artefact; Lab 2: The Meridian Sales Dashboard</w:t>
+            </w:r>
+          </w:p>
+        </w:tc>
+      </w:tr>
+      <w:tr>
+        <w:tc>
+          <w:tcPr>
+            <w:tcW w:type="dxa" w:w="1656"/>
+            <w:shd w:val="clear" w:color="auto" w:fill="FDE9D9"/>
+          </w:tcPr>
+          <w:p>
+            <w:r/>
+            <w:r>
+              <w:rPr>
+                <w:rFonts w:ascii="Arial" w:hAnsi="Arial"/>
+                <w:b w:val="0"/>
+                <w:sz w:val="19"/>
+              </w:rPr>
+              <w:t>12:30–13:30</w:t>
+            </w:r>
+          </w:p>
+        </w:tc>
+        <w:tc>
+          <w:tcPr>
+            <w:tcW w:type="dxa" w:w="1296"/>
+            <w:shd w:val="clear" w:color="auto" w:fill="FDE9D9"/>
+          </w:tcPr>
+          <w:p>
+            <w:r/>
+            <w:r>
+              <w:rPr>
+                <w:rFonts w:ascii="Arial" w:hAnsi="Arial"/>
+                <w:b w:val="0"/>
+                <w:sz w:val="19"/>
+              </w:rPr>
+              <w:t>60 min</w:t>
+            </w:r>
+          </w:p>
+        </w:tc>
+        <w:tc>
+          <w:tcPr>
+            <w:tcW w:type="dxa" w:w="6840"/>
+            <w:shd w:val="clear" w:color="auto" w:fill="FDE9D9"/>
+          </w:tcPr>
+          <w:p>
+            <w:r/>
+            <w:r>
+              <w:rPr>
+                <w:rFonts w:ascii="Arial" w:hAnsi="Arial"/>
+                <w:b w:val="0"/>
+                <w:sz w:val="19"/>
+              </w:rPr>
+              <w:t>Lunch break</w:t>
+            </w:r>
+          </w:p>
+        </w:tc>
+      </w:tr>
+      <w:tr>
+        <w:tc>
+          <w:tcPr>
+            <w:tcW w:type="dxa" w:w="1656"/>
+            <w:shd w:val="clear" w:color="auto" w:fill="E8F0FE"/>
+          </w:tcPr>
+          <w:p>
+            <w:r/>
+            <w:r>
+              <w:rPr>
+                <w:rFonts w:ascii="Arial" w:hAnsi="Arial"/>
+                <w:b/>
+                <w:sz w:val="19"/>
+              </w:rPr>
+              <w:t>13:30–14:05</w:t>
+            </w:r>
+          </w:p>
+        </w:tc>
+        <w:tc>
+          <w:tcPr>
+            <w:tcW w:type="dxa" w:w="1296"/>
+            <w:shd w:val="clear" w:color="auto" w:fill="E8F0FE"/>
+          </w:tcPr>
+          <w:p>
+            <w:r/>
+            <w:r>
+              <w:rPr>
+                <w:rFonts w:ascii="Arial" w:hAnsi="Arial"/>
+                <w:b w:val="0"/>
+                <w:sz w:val="19"/>
+              </w:rPr>
+              <w:t>35 min</w:t>
+            </w:r>
+          </w:p>
+        </w:tc>
+        <w:tc>
+          <w:tcPr>
+            <w:tcW w:type="dxa" w:w="6840"/>
+            <w:shd w:val="clear" w:color="auto" w:fill="E8F0FE"/>
+          </w:tcPr>
+          <w:p>
+            <w:r/>
+            <w:r>
+              <w:rPr>
+                <w:rFonts w:ascii="Arial" w:hAnsi="Arial"/>
+                <w:b/>
+                <w:sz w:val="19"/>
+              </w:rPr>
+              <w:t>Topic 2 — Tools and Skills: connectors, Drive scope and permissions, Gmail approval</w:t>
+            </w:r>
+          </w:p>
+        </w:tc>
+      </w:tr>
+      <w:tr>
+        <w:tc>
+          <w:tcPr>
+            <w:tcW w:type="dxa" w:w="1656"/>
+          </w:tcPr>
+          <w:p>
+            <w:r/>
+            <w:r>
+              <w:rPr>
+                <w:rFonts w:ascii="Arial" w:hAnsi="Arial"/>
+                <w:b w:val="0"/>
+                <w:sz w:val="19"/>
+              </w:rPr>
+              <w:t>14:05–15:20</w:t>
+            </w:r>
+          </w:p>
+        </w:tc>
+        <w:tc>
+          <w:tcPr>
+            <w:tcW w:type="dxa" w:w="1296"/>
+          </w:tcPr>
+          <w:p>
+            <w:r/>
+            <w:r>
+              <w:rPr>
+                <w:rFonts w:ascii="Arial" w:hAnsi="Arial"/>
+                <w:b w:val="0"/>
+                <w:sz w:val="19"/>
+              </w:rPr>
+              <w:t>75 min</w:t>
+            </w:r>
+          </w:p>
+        </w:tc>
+        <w:tc>
+          <w:tcPr>
+            <w:tcW w:type="dxa" w:w="6840"/>
+          </w:tcPr>
+          <w:p>
+            <w:r/>
+            <w:r>
+              <w:rPr>
+                <w:rFonts w:ascii="Arial" w:hAnsi="Arial"/>
+                <w:b w:val="0"/>
+                <w:sz w:val="19"/>
+              </w:rPr>
+              <w:t>Hands-on: Lab 3: Connect Google Drive; Lab 4: Refresh the Dashboard and Send the Summary</w:t>
+            </w:r>
+          </w:p>
+        </w:tc>
+      </w:tr>
+      <w:tr>
+        <w:tc>
+          <w:tcPr>
+            <w:tcW w:type="dxa" w:w="1656"/>
+            <w:shd w:val="clear" w:color="auto" w:fill="FFF4E5"/>
+          </w:tcPr>
+          <w:p>
+            <w:r/>
+            <w:r>
+              <w:rPr>
+                <w:rFonts w:ascii="Arial" w:hAnsi="Arial"/>
+                <w:b w:val="0"/>
+                <w:sz w:val="19"/>
+              </w:rPr>
+              <w:t>15:20–15:35</w:t>
+            </w:r>
+          </w:p>
+        </w:tc>
+        <w:tc>
+          <w:tcPr>
+            <w:tcW w:type="dxa" w:w="1296"/>
+            <w:shd w:val="clear" w:color="auto" w:fill="FFF4E5"/>
+          </w:tcPr>
+          <w:p>
+            <w:r/>
+            <w:r>
+              <w:rPr>
+                <w:rFonts w:ascii="Arial" w:hAnsi="Arial"/>
+                <w:b w:val="0"/>
+                <w:sz w:val="19"/>
+              </w:rPr>
+              <w:t>15 min</w:t>
+            </w:r>
+          </w:p>
+        </w:tc>
+        <w:tc>
+          <w:tcPr>
+            <w:tcW w:type="dxa" w:w="6840"/>
+            <w:shd w:val="clear" w:color="auto" w:fill="FFF4E5"/>
+          </w:tcPr>
+          <w:p>
+            <w:r/>
+            <w:r>
+              <w:rPr>
+                <w:rFonts w:ascii="Arial" w:hAnsi="Arial"/>
+                <w:b w:val="0"/>
+                <w:sz w:val="19"/>
+              </w:rPr>
+              <w:t>Tea break</w:t>
+            </w:r>
+          </w:p>
+        </w:tc>
+      </w:tr>
+      <w:tr>
+        <w:tc>
+          <w:tcPr>
+            <w:tcW w:type="dxa" w:w="1656"/>
+            <w:shd w:val="clear" w:color="auto" w:fill="E8F0FE"/>
+          </w:tcPr>
+          <w:p>
+            <w:r/>
+            <w:r>
+              <w:rPr>
+                <w:rFonts w:ascii="Arial" w:hAnsi="Arial"/>
+                <w:b/>
+                <w:sz w:val="19"/>
+              </w:rPr>
+              <w:t>15:35–15:55</w:t>
+            </w:r>
+          </w:p>
+        </w:tc>
+        <w:tc>
+          <w:tcPr>
+            <w:tcW w:type="dxa" w:w="1296"/>
+            <w:shd w:val="clear" w:color="auto" w:fill="E8F0FE"/>
+          </w:tcPr>
+          <w:p>
+            <w:r/>
+            <w:r>
+              <w:rPr>
+                <w:rFonts w:ascii="Arial" w:hAnsi="Arial"/>
+                <w:b w:val="0"/>
+                <w:sz w:val="19"/>
+              </w:rPr>
+              <w:t>20 min</w:t>
+            </w:r>
+          </w:p>
+        </w:tc>
+        <w:tc>
+          <w:tcPr>
+            <w:tcW w:type="dxa" w:w="6840"/>
+            <w:shd w:val="clear" w:color="auto" w:fill="E8F0FE"/>
+          </w:tcPr>
+          <w:p>
+            <w:r/>
+            <w:r>
+              <w:rPr>
+                <w:rFonts w:ascii="Arial" w:hAnsi="Arial"/>
+                <w:b/>
+                <w:sz w:val="19"/>
+              </w:rPr>
+              <w:t>Topic 2 — Agent Skills: SKILL.md and a routine that drives your connected tools</w:t>
+            </w:r>
+          </w:p>
+        </w:tc>
+      </w:tr>
+      <w:tr>
+        <w:tc>
+          <w:tcPr>
+            <w:tcW w:type="dxa" w:w="1656"/>
+          </w:tcPr>
+          <w:p>
+            <w:r/>
+            <w:r>
+              <w:rPr>
+                <w:rFonts w:ascii="Arial" w:hAnsi="Arial"/>
+                <w:b w:val="0"/>
+                <w:sz w:val="19"/>
+              </w:rPr>
+              <w:t>15:55–16:35</w:t>
+            </w:r>
+          </w:p>
+        </w:tc>
+        <w:tc>
+          <w:tcPr>
+            <w:tcW w:type="dxa" w:w="1296"/>
+          </w:tcPr>
+          <w:p>
+            <w:r/>
+            <w:r>
+              <w:rPr>
+                <w:rFonts w:ascii="Arial" w:hAnsi="Arial"/>
+                <w:b w:val="0"/>
+                <w:sz w:val="19"/>
+              </w:rPr>
+              <w:t>40 min</w:t>
+            </w:r>
+          </w:p>
+        </w:tc>
+        <w:tc>
+          <w:tcPr>
+            <w:tcW w:type="dxa" w:w="6840"/>
+          </w:tcPr>
+          <w:p>
+            <w:r/>
+            <w:r>
+              <w:rPr>
+                <w:rFonts w:ascii="Arial" w:hAnsi="Arial"/>
+                <w:b w:val="0"/>
+                <w:sz w:val="19"/>
+              </w:rPr>
+              <w:t>Hands-on: Lab 5: Build a /daily-brief Skill</w:t>
+            </w:r>
+          </w:p>
+        </w:tc>
+      </w:tr>
+      <w:tr>
+        <w:tc>
+          <w:tcPr>
+            <w:tcW w:type="dxa" w:w="1656"/>
+            <w:shd w:val="clear" w:color="auto" w:fill="E8F0FE"/>
+          </w:tcPr>
+          <w:p>
+            <w:r/>
+            <w:r>
+              <w:rPr>
+                <w:rFonts w:ascii="Arial" w:hAnsi="Arial"/>
+                <w:b/>
+                <w:sz w:val="19"/>
+              </w:rPr>
+              <w:t>16:35–16:55</w:t>
+            </w:r>
+          </w:p>
+        </w:tc>
+        <w:tc>
+          <w:tcPr>
+            <w:tcW w:type="dxa" w:w="1296"/>
+            <w:shd w:val="clear" w:color="auto" w:fill="E8F0FE"/>
+          </w:tcPr>
+          <w:p>
+            <w:r/>
+            <w:r>
+              <w:rPr>
+                <w:rFonts w:ascii="Arial" w:hAnsi="Arial"/>
+                <w:b w:val="0"/>
+                <w:sz w:val="19"/>
+              </w:rPr>
+              <w:t>20 min</w:t>
+            </w:r>
+          </w:p>
+        </w:tc>
+        <w:tc>
+          <w:tcPr>
+            <w:tcW w:type="dxa" w:w="6840"/>
+            <w:shd w:val="clear" w:color="auto" w:fill="E8F0FE"/>
+          </w:tcPr>
+          <w:p>
+            <w:r/>
+            <w:r>
+              <w:rPr>
+                <w:rFonts w:ascii="Arial" w:hAnsi="Arial"/>
+                <w:b/>
+                <w:sz w:val="19"/>
+              </w:rPr>
+              <w:t>Topic 3 — Claude Projects: project knowledge, custom instructions, sharing</w:t>
+            </w:r>
+          </w:p>
+        </w:tc>
+      </w:tr>
+      <w:tr>
+        <w:tc>
+          <w:tcPr>
+            <w:tcW w:type="dxa" w:w="1656"/>
+          </w:tcPr>
+          <w:p>
+            <w:r/>
+            <w:r>
+              <w:rPr>
+                <w:rFonts w:ascii="Arial" w:hAnsi="Arial"/>
+                <w:b w:val="0"/>
+                <w:sz w:val="19"/>
+              </w:rPr>
+              <w:t>16:55–17:40</w:t>
+            </w:r>
+          </w:p>
+        </w:tc>
+        <w:tc>
+          <w:tcPr>
+            <w:tcW w:type="dxa" w:w="1296"/>
+          </w:tcPr>
+          <w:p>
+            <w:r/>
+            <w:r>
+              <w:rPr>
+                <w:rFonts w:ascii="Arial" w:hAnsi="Arial"/>
+                <w:b w:val="0"/>
+                <w:sz w:val="19"/>
+              </w:rPr>
+              <w:t>45 min</w:t>
+            </w:r>
+          </w:p>
+        </w:tc>
+        <w:tc>
+          <w:tcPr>
+            <w:tcW w:type="dxa" w:w="6840"/>
+          </w:tcPr>
+          <w:p>
+            <w:r/>
+            <w:r>
+              <w:rPr>
+                <w:rFonts w:ascii="Arial" w:hAnsi="Arial"/>
+                <w:b w:val="0"/>
+                <w:sz w:val="19"/>
+              </w:rPr>
+              <w:t>Hands-on: Lab 6: Build the Meridian Claude Project</w:t>
+            </w:r>
+          </w:p>
+        </w:tc>
+      </w:tr>
+      <w:tr>
+        <w:tc>
+          <w:tcPr>
+            <w:tcW w:type="dxa" w:w="1656"/>
+            <w:shd w:val="clear" w:color="auto" w:fill="F3F5F8"/>
+          </w:tcPr>
+          <w:p>
+            <w:r/>
+            <w:r>
+              <w:rPr>
+                <w:rFonts w:ascii="Arial" w:hAnsi="Arial"/>
+                <w:b w:val="0"/>
+                <w:sz w:val="19"/>
+              </w:rPr>
+              <w:t>17:40–18:00</w:t>
+            </w:r>
+          </w:p>
+        </w:tc>
+        <w:tc>
+          <w:tcPr>
+            <w:tcW w:type="dxa" w:w="1296"/>
+            <w:shd w:val="clear" w:color="auto" w:fill="F3F5F8"/>
+          </w:tcPr>
+          <w:p>
+            <w:r/>
+            <w:r>
+              <w:rPr>
+                <w:rFonts w:ascii="Arial" w:hAnsi="Arial"/>
+                <w:b w:val="0"/>
+                <w:sz w:val="19"/>
+              </w:rPr>
+              <w:t>20 min</w:t>
+            </w:r>
+          </w:p>
+        </w:tc>
+        <w:tc>
+          <w:tcPr>
+            <w:tcW w:type="dxa" w:w="6840"/>
+            <w:shd w:val="clear" w:color="auto" w:fill="F3F5F8"/>
+          </w:tcPr>
+          <w:p>
+            <w:r/>
+            <w:r>
+              <w:rPr>
+                <w:rFonts w:ascii="Arial" w:hAnsi="Arial"/>
+                <w:b w:val="0"/>
+                <w:sz w:val="19"/>
+              </w:rPr>
+              <w:t>Recap, your reusable Meridian workspace and Q&amp;A</w:t>
+            </w:r>
+          </w:p>
+        </w:tc>
+      </w:tr>
+    </w:tbl>
+    <w:p>
+      <w:r>
+        <w:rPr>
+          <w:i/>
+          <w:color w:val="555B66"/>
+          <w:sz w:val="19"/>
+        </w:rPr>
+        <w:t>Total scheduled time: 480 minutes (8 hours) excluding lunch — of which 450 minutes (7.5 hours) are instructional, plus 30 minutes of tea breaks.</w:t>
+      </w:r>
+    </w:p>
+    <w:p>
+      <w:pPr>
+        <w:pStyle w:val="Heading1"/>
+      </w:pPr>
+      <w:r>
+        <w:t>Lab Reference (aligned to course topics)</w:t>
+      </w:r>
+    </w:p>
+    <w:tbl>
+      <w:tblPr>
+        <w:tblStyle w:val="TableGrid"/>
+        <w:tblW w:type="auto" w:w="0"/>
+        <w:tblLook w:firstColumn="1" w:firstRow="1" w:lastColumn="0" w:lastRow="0" w:noHBand="0" w:noVBand="1" w:val="04A0"/>
+      </w:tblPr>
+      <w:tblGrid>
+        <w:gridCol w:w="2880"/>
+        <w:gridCol w:w="2880"/>
+        <w:gridCol w:w="2880"/>
+      </w:tblGrid>
+      <w:tr>
+        <w:tc>
+          <w:tcPr>
+            <w:tcW w:type="dxa" w:w="2880"/>
+            <w:shd w:val="clear" w:color="auto" w:fill="1F6FEB"/>
+          </w:tcPr>
+          <w:p>
+            <w:r/>
+            <w:r>
+              <w:rPr>
+                <w:rFonts w:ascii="Arial" w:hAnsi="Arial"/>
+                <w:b/>
+                <w:color w:val="FFFFFF"/>
+                <w:sz w:val="20"/>
+              </w:rPr>
+              <w:t>Topic</w:t>
+            </w:r>
+          </w:p>
+        </w:tc>
+        <w:tc>
+          <w:tcPr>
+            <w:tcW w:type="dxa" w:w="2880"/>
+            <w:shd w:val="clear" w:color="auto" w:fill="1F6FEB"/>
+          </w:tcPr>
+          <w:p>
+            <w:r/>
+            <w:r>
+              <w:rPr>
+                <w:rFonts w:ascii="Arial" w:hAnsi="Arial"/>
+                <w:b/>
+                <w:color w:val="FFFFFF"/>
+                <w:sz w:val="20"/>
+              </w:rPr>
+              <w:t>Scheduled time</w:t>
+            </w:r>
+          </w:p>
+        </w:tc>
+        <w:tc>
+          <w:tcPr>
+            <w:tcW w:type="dxa" w:w="2880"/>
+            <w:shd w:val="clear" w:color="auto" w:fill="1F6FEB"/>
+          </w:tcPr>
+          <w:p>
+            <w:r/>
+            <w:r>
+              <w:rPr>
+                <w:rFonts w:ascii="Arial" w:hAnsi="Arial"/>
+                <w:b/>
+                <w:color w:val="FFFFFF"/>
+                <w:sz w:val="20"/>
+              </w:rPr>
+              <w:t>Labs</w:t>
+            </w:r>
+          </w:p>
+        </w:tc>
+      </w:tr>
+      <w:tr>
+        <w:tc>
+          <w:tcPr>
+            <w:tcW w:type="dxa" w:w="2880"/>
+            <w:shd w:val="clear" w:color="auto" w:fill="E8F0FE"/>
+          </w:tcPr>
+          <w:p>
+            <w:r/>
+            <w:r>
+              <w:rPr>
+                <w:rFonts w:ascii="Arial" w:hAnsi="Arial"/>
+                <w:b/>
+                <w:sz w:val="19"/>
+              </w:rPr>
+              <w:t>Topic 01: Claude Cowork Fundamentals</w:t>
+            </w:r>
+          </w:p>
+        </w:tc>
+        <w:tc>
+          <w:tcPr>
+            <w:tcW w:type="dxa" w:w="2880"/>
+            <w:shd w:val="clear" w:color="auto" w:fill="E8F0FE"/>
+          </w:tcPr>
+          <w:p>
+            <w:r/>
+            <w:r>
+              <w:rPr>
+                <w:rFonts w:ascii="Arial" w:hAnsi="Arial"/>
+                <w:b w:val="0"/>
+                <w:sz w:val="19"/>
+              </w:rPr>
+              <w:t>175 min (2 h 55 min)</w:t>
             </w:r>
           </w:p>
         </w:tc>
@@ -204,8 +1968,50 @@
             <w:tcW w:type="dxa" w:w="2880"/>
           </w:tcPr>
           <w:p>
+            <w:r/>
             <w:r>
-              <w:t>Minutes</w:t>
+              <w:rPr>
+                <w:rFonts w:ascii="Arial" w:hAnsi="Arial"/>
+                <w:b w:val="0"/>
+                <w:sz w:val="19"/>
+              </w:rPr>
+              <w:t>Lab 1, Lab 2</w:t>
+            </w:r>
+          </w:p>
+        </w:tc>
+      </w:tr>
+      <w:tr>
+        <w:tc>
+          <w:tcPr>
+            <w:tcW w:type="dxa" w:w="2880"/>
+            <w:shd w:val="clear" w:color="auto" w:fill="E8F0FE"/>
+          </w:tcPr>
+          <w:p>
+            <w:r/>
+            <w:r>
+              <w:rPr>
+                <w:rFonts w:ascii="Arial" w:hAnsi="Arial"/>
+                <w:b/>
+                <w:sz w:val="19"/>
+              </w:rPr>
+              <w:t>Topic 02: Tools and Skills</w:t>
+            </w:r>
+          </w:p>
+        </w:tc>
+        <w:tc>
+          <w:tcPr>
+            <w:tcW w:type="dxa" w:w="2880"/>
+            <w:shd w:val="clear" w:color="auto" w:fill="E8F0FE"/>
+          </w:tcPr>
+          <w:p>
+            <w:r/>
+            <w:r>
+              <w:rPr>
+                <w:rFonts w:ascii="Arial" w:hAnsi="Arial"/>
+                <w:b w:val="0"/>
+                <w:sz w:val="19"/>
+              </w:rPr>
+              <w:t>170 min (2 h 50 min)</w:t>
             </w:r>
           </w:p>
         </w:tc>
@@ -214,8 +2020,14 @@
             <w:tcW w:type="dxa" w:w="2880"/>
           </w:tcPr>
           <w:p>
+            <w:r/>
             <w:r>
-              <w:t>Session</w:t>
+              <w:rPr>
+                <w:rFonts w:ascii="Arial" w:hAnsi="Arial"/>
+                <w:b w:val="0"/>
+                <w:sz w:val="19"/>
+              </w:rPr>
+              <w:t>Lab 3, Lab 4, Lab 5</w:t>
             </w:r>
           </w:p>
         </w:tc>
@@ -224,10 +2036,34 @@
         <w:tc>
           <w:tcPr>
             <w:tcW w:type="dxa" w:w="2880"/>
+            <w:shd w:val="clear" w:color="auto" w:fill="E8F0FE"/>
           </w:tcPr>
           <w:p>
+            <w:r/>
             <w:r>
-              <w:t>09:00–09:15</w:t>
+              <w:rPr>
+                <w:rFonts w:ascii="Arial" w:hAnsi="Arial"/>
+                <w:b/>
+                <w:sz w:val="19"/>
+              </w:rPr>
+              <w:t>Topic 03: Claude Projects</w:t>
+            </w:r>
+          </w:p>
+        </w:tc>
+        <w:tc>
+          <w:tcPr>
+            <w:tcW w:type="dxa" w:w="2880"/>
+            <w:shd w:val="clear" w:color="auto" w:fill="E8F0FE"/>
+          </w:tcPr>
+          <w:p>
+            <w:r/>
+            <w:r>
+              <w:rPr>
+                <w:rFonts w:ascii="Arial" w:hAnsi="Arial"/>
+                <w:b w:val="0"/>
+                <w:sz w:val="19"/>
+              </w:rPr>
+              <w:t>65 min (1 h 5 min)</w:t>
             </w:r>
           </w:p>
         </w:tc>
@@ -236,562 +2072,21 @@
             <w:tcW w:type="dxa" w:w="2880"/>
           </w:tcPr>
           <w:p>
+            <w:r/>
             <w:r>
-              <w:t>15</w:t>
-            </w:r>
-          </w:p>
-        </w:tc>
-        <w:tc>
-          <w:tcPr>
-            <w:tcW w:type="dxa" w:w="2880"/>
-          </w:tcPr>
-          <w:p>
-            <w:r>
-              <w:t>Welcome and task-automation project setup</w:t>
-            </w:r>
-          </w:p>
-        </w:tc>
-      </w:tr>
-      <w:tr>
-        <w:tc>
-          <w:tcPr>
-            <w:tcW w:type="dxa" w:w="2880"/>
-          </w:tcPr>
-          <w:p>
-            <w:r>
-              <w:t>09:15–09:35</w:t>
-            </w:r>
-          </w:p>
-        </w:tc>
-        <w:tc>
-          <w:tcPr>
-            <w:tcW w:type="dxa" w:w="2880"/>
-          </w:tcPr>
-          <w:p>
-            <w:r>
-              <w:t>20</w:t>
-            </w:r>
-          </w:p>
-        </w:tc>
-        <w:tc>
-          <w:tcPr>
-            <w:tcW w:type="dxa" w:w="2880"/>
-          </w:tcPr>
-          <w:p>
-            <w:r>
-              <w:t>Topic 1 demo: projects, folders and reusable skills</w:t>
-            </w:r>
-          </w:p>
-        </w:tc>
-      </w:tr>
-      <w:tr>
-        <w:tc>
-          <w:tcPr>
-            <w:tcW w:type="dxa" w:w="2880"/>
-          </w:tcPr>
-          <w:p>
-            <w:r>
-              <w:t>09:35–10:10</w:t>
-            </w:r>
-          </w:p>
-        </w:tc>
-        <w:tc>
-          <w:tcPr>
-            <w:tcW w:type="dxa" w:w="2880"/>
-          </w:tcPr>
-          <w:p>
-            <w:r>
-              <w:t>35</w:t>
-            </w:r>
-          </w:p>
-        </w:tc>
-        <w:tc>
-          <w:tcPr>
-            <w:tcW w:type="dxa" w:w="2880"/>
-          </w:tcPr>
-          <w:p>
-            <w:r>
-              <w:t>Lab 1: Create a Cowork Project</w:t>
-            </w:r>
-          </w:p>
-        </w:tc>
-      </w:tr>
-      <w:tr>
-        <w:tc>
-          <w:tcPr>
-            <w:tcW w:type="dxa" w:w="2880"/>
-          </w:tcPr>
-          <w:p>
-            <w:r>
-              <w:t>10:10–10:25</w:t>
-            </w:r>
-          </w:p>
-        </w:tc>
-        <w:tc>
-          <w:tcPr>
-            <w:tcW w:type="dxa" w:w="2880"/>
-          </w:tcPr>
-          <w:p>
-            <w:r>
-              <w:t>15</w:t>
-            </w:r>
-          </w:p>
-        </w:tc>
-        <w:tc>
-          <w:tcPr>
-            <w:tcW w:type="dxa" w:w="2880"/>
-          </w:tcPr>
-          <w:p>
-            <w:r>
-              <w:t>Tea break</w:t>
-            </w:r>
-          </w:p>
-        </w:tc>
-      </w:tr>
-      <w:tr>
-        <w:tc>
-          <w:tcPr>
-            <w:tcW w:type="dxa" w:w="2880"/>
-          </w:tcPr>
-          <w:p>
-            <w:r>
-              <w:t>10:25–11:20</w:t>
-            </w:r>
-          </w:p>
-        </w:tc>
-        <w:tc>
-          <w:tcPr>
-            <w:tcW w:type="dxa" w:w="2880"/>
-          </w:tcPr>
-          <w:p>
-            <w:r>
-              <w:t>55</w:t>
-            </w:r>
-          </w:p>
-        </w:tc>
-        <w:tc>
-          <w:tcPr>
-            <w:tcW w:type="dxa" w:w="2880"/>
-          </w:tcPr>
-          <w:p>
-            <w:r>
-              <w:t>Lab 2: Refresh an Excel Dashboard</w:t>
-            </w:r>
-          </w:p>
-        </w:tc>
-      </w:tr>
-      <w:tr>
-        <w:tc>
-          <w:tcPr>
-            <w:tcW w:type="dxa" w:w="2880"/>
-          </w:tcPr>
-          <w:p>
-            <w:r>
-              <w:t>11:20–11:40</w:t>
-            </w:r>
-          </w:p>
-        </w:tc>
-        <w:tc>
-          <w:tcPr>
-            <w:tcW w:type="dxa" w:w="2880"/>
-          </w:tcPr>
-          <w:p>
-            <w:r>
-              <w:t>20</w:t>
-            </w:r>
-          </w:p>
-        </w:tc>
-        <w:tc>
-          <w:tcPr>
-            <w:tcW w:type="dxa" w:w="2880"/>
-          </w:tcPr>
-          <w:p>
-            <w:r>
-              <w:t>Topic 2 demo: research and output design</w:t>
-            </w:r>
-          </w:p>
-        </w:tc>
-      </w:tr>
-      <w:tr>
-        <w:tc>
-          <w:tcPr>
-            <w:tcW w:type="dxa" w:w="2880"/>
-          </w:tcPr>
-          <w:p>
-            <w:r>
-              <w:t>11:40–12:30</w:t>
-            </w:r>
-          </w:p>
-        </w:tc>
-        <w:tc>
-          <w:tcPr>
-            <w:tcW w:type="dxa" w:w="2880"/>
-          </w:tcPr>
-          <w:p>
-            <w:r>
-              <w:t>50</w:t>
-            </w:r>
-          </w:p>
-        </w:tc>
-        <w:tc>
-          <w:tcPr>
-            <w:tcW w:type="dxa" w:w="2880"/>
-          </w:tcPr>
-          <w:p>
-            <w:r>
-              <w:t>Lab 3: Research AI-in-Finance News</w:t>
-            </w:r>
-          </w:p>
-        </w:tc>
-      </w:tr>
-      <w:tr>
-        <w:tc>
-          <w:tcPr>
-            <w:tcW w:type="dxa" w:w="2880"/>
-          </w:tcPr>
-          <w:p>
-            <w:r>
-              <w:t>12:30–13:30</w:t>
-            </w:r>
-          </w:p>
-        </w:tc>
-        <w:tc>
-          <w:tcPr>
-            <w:tcW w:type="dxa" w:w="2880"/>
-          </w:tcPr>
-          <w:p>
-            <w:r>
-              <w:t>60</w:t>
-            </w:r>
-          </w:p>
-        </w:tc>
-        <w:tc>
-          <w:tcPr>
-            <w:tcW w:type="dxa" w:w="2880"/>
-          </w:tcPr>
-          <w:p>
-            <w:r>
-              <w:t>Lunch</w:t>
-            </w:r>
-          </w:p>
-        </w:tc>
-      </w:tr>
-      <w:tr>
-        <w:tc>
-          <w:tcPr>
-            <w:tcW w:type="dxa" w:w="2880"/>
-          </w:tcPr>
-          <w:p>
-            <w:r>
-              <w:t>13:30–14:25</w:t>
-            </w:r>
-          </w:p>
-        </w:tc>
-        <w:tc>
-          <w:tcPr>
-            <w:tcW w:type="dxa" w:w="2880"/>
-          </w:tcPr>
-          <w:p>
-            <w:r>
-              <w:t>55</w:t>
-            </w:r>
-          </w:p>
-        </w:tc>
-        <w:tc>
-          <w:tcPr>
-            <w:tcW w:type="dxa" w:w="2880"/>
-          </w:tcPr>
-          <w:p>
-            <w:r>
-              <w:t>Lab 4: Turn Finance Data into Slides</w:t>
-            </w:r>
-          </w:p>
-        </w:tc>
-      </w:tr>
-      <w:tr>
-        <w:tc>
-          <w:tcPr>
-            <w:tcW w:type="dxa" w:w="2880"/>
-          </w:tcPr>
-          <w:p>
-            <w:r>
-              <w:t>14:25–14:45</w:t>
-            </w:r>
-          </w:p>
-        </w:tc>
-        <w:tc>
-          <w:tcPr>
-            <w:tcW w:type="dxa" w:w="2880"/>
-          </w:tcPr>
-          <w:p>
-            <w:r>
-              <w:t>20</w:t>
-            </w:r>
-          </w:p>
-        </w:tc>
-        <w:tc>
-          <w:tcPr>
-            <w:tcW w:type="dxa" w:w="2880"/>
-          </w:tcPr>
-          <w:p>
-            <w:r>
-              <w:t>Topic 3 demo: extract, explain, monitor and deliver</w:t>
-            </w:r>
-          </w:p>
-        </w:tc>
-      </w:tr>
-      <w:tr>
-        <w:tc>
-          <w:tcPr>
-            <w:tcW w:type="dxa" w:w="2880"/>
-          </w:tcPr>
-          <w:p>
-            <w:r>
-              <w:t>14:45–15:30</w:t>
-            </w:r>
-          </w:p>
-        </w:tc>
-        <w:tc>
-          <w:tcPr>
-            <w:tcW w:type="dxa" w:w="2880"/>
-          </w:tcPr>
-          <w:p>
-            <w:r>
-              <w:t>45</w:t>
-            </w:r>
-          </w:p>
-        </w:tc>
-        <w:tc>
-          <w:tcPr>
-            <w:tcW w:type="dxa" w:w="2880"/>
-          </w:tcPr>
-          <w:p>
-            <w:r>
-              <w:t>Lab 5: Invoices to AP Tracker</w:t>
-            </w:r>
-          </w:p>
-        </w:tc>
-      </w:tr>
-      <w:tr>
-        <w:tc>
-          <w:tcPr>
-            <w:tcW w:type="dxa" w:w="2880"/>
-          </w:tcPr>
-          <w:p>
-            <w:r>
-              <w:t>15:30–15:45</w:t>
-            </w:r>
-          </w:p>
-        </w:tc>
-        <w:tc>
-          <w:tcPr>
-            <w:tcW w:type="dxa" w:w="2880"/>
-          </w:tcPr>
-          <w:p>
-            <w:r>
-              <w:t>15</w:t>
-            </w:r>
-          </w:p>
-        </w:tc>
-        <w:tc>
-          <w:tcPr>
-            <w:tcW w:type="dxa" w:w="2880"/>
-          </w:tcPr>
-          <w:p>
-            <w:r>
-              <w:t>Tea break</w:t>
-            </w:r>
-          </w:p>
-        </w:tc>
-      </w:tr>
-      <w:tr>
-        <w:tc>
-          <w:tcPr>
-            <w:tcW w:type="dxa" w:w="2880"/>
-          </w:tcPr>
-          <w:p>
-            <w:r>
-              <w:t>15:45–16:30</w:t>
-            </w:r>
-          </w:p>
-        </w:tc>
-        <w:tc>
-          <w:tcPr>
-            <w:tcW w:type="dxa" w:w="2880"/>
-          </w:tcPr>
-          <w:p>
-            <w:r>
-              <w:t>45</w:t>
-            </w:r>
-          </w:p>
-        </w:tc>
-        <w:tc>
-          <w:tcPr>
-            <w:tcW w:type="dxa" w:w="2880"/>
-          </w:tcPr>
-          <w:p>
-            <w:r>
-              <w:t>Lab 6: Budget Variance Commentary</w:t>
-            </w:r>
-          </w:p>
-        </w:tc>
-      </w:tr>
-      <w:tr>
-        <w:tc>
-          <w:tcPr>
-            <w:tcW w:type="dxa" w:w="2880"/>
-          </w:tcPr>
-          <w:p>
-            <w:r>
-              <w:t>16:30–17:15</w:t>
-            </w:r>
-          </w:p>
-        </w:tc>
-        <w:tc>
-          <w:tcPr>
-            <w:tcW w:type="dxa" w:w="2880"/>
-          </w:tcPr>
-          <w:p>
-            <w:r>
-              <w:t>45</w:t>
-            </w:r>
-          </w:p>
-        </w:tc>
-        <w:tc>
-          <w:tcPr>
-            <w:tcW w:type="dxa" w:w="2880"/>
-          </w:tcPr>
-          <w:p>
-            <w:r>
-              <w:t>Lab 7: Cash-Flow Watchlist</w:t>
-            </w:r>
-          </w:p>
-        </w:tc>
-      </w:tr>
-      <w:tr>
-        <w:tc>
-          <w:tcPr>
-            <w:tcW w:type="dxa" w:w="2880"/>
-          </w:tcPr>
-          <w:p>
-            <w:r>
-              <w:t>17:15–18:00</w:t>
-            </w:r>
-          </w:p>
-        </w:tc>
-        <w:tc>
-          <w:tcPr>
-            <w:tcW w:type="dxa" w:w="2880"/>
-          </w:tcPr>
-          <w:p>
-            <w:r>
-              <w:t>45</w:t>
-            </w:r>
-          </w:p>
-        </w:tc>
-        <w:tc>
-          <w:tcPr>
-            <w:tcW w:type="dxa" w:w="2880"/>
-          </w:tcPr>
-          <w:p>
-            <w:r>
-              <w:t>Lab 8: Weekly Finance Briefing</w:t>
+              <w:rPr>
+                <w:rFonts w:ascii="Arial" w:hAnsi="Arial"/>
+                <w:b w:val="0"/>
+                <w:sz w:val="19"/>
+              </w:rPr>
+              <w:t>Lab 6</w:t>
             </w:r>
           </w:p>
         </w:tc>
       </w:tr>
     </w:tbl>
-    <w:p>
-      <w:r>
-        <w:t>Scheduled time excluding lunch: 480 minutes. Instructional and lab time: 450 minutes. Tea breaks: 30 minutes.</w:t>
-      </w:r>
-    </w:p>
-    <w:p>
-      <w:pPr>
-        <w:pStyle w:val="Heading1"/>
-      </w:pPr>
-      <w:r>
-        <w:t>Facilitation approach</w:t>
-      </w:r>
-    </w:p>
-    <w:p>
-      <w:r>
-        <w:t>Each scenario begins with a visual before-and-after story, a short demonstration and a self-contained lab. Learners use fictional data, review Cowork’s plan, generate an output, and verify it against the folder checklist. Detailed procedures are in each lab folder and the Learner Guide.</w:t>
-      </w:r>
-    </w:p>
-    <w:p>
-      <w:pPr>
-        <w:pStyle w:val="Heading1"/>
-      </w:pPr>
-      <w:r>
-        <w:t>Learning reinforcement</w:t>
-      </w:r>
-    </w:p>
-    <w:p>
-      <w:pPr>
-        <w:pStyle w:val="ListBullet"/>
-      </w:pPr>
-      <w:r>
-        <w:t>Lab 1: File map lists every source; originals stay unchanged</w:t>
-      </w:r>
-    </w:p>
-    <w:p>
-      <w:pPr>
-        <w:pStyle w:val="ListBullet"/>
-      </w:pPr>
-      <w:r>
-        <w:t>Lab 2: September: revenue S$128k, expenses S$89.5k, net S$38.5k</w:t>
-      </w:r>
-    </w:p>
-    <w:p>
-      <w:pPr>
-        <w:pStyle w:val="ListBullet"/>
-      </w:pPr>
-      <w:r>
-        <w:t>Lab 3: Six direct links open; every date and summary is sourced</w:t>
-      </w:r>
-    </w:p>
-    <w:p>
-      <w:pPr>
-        <w:pStyle w:val="ListBullet"/>
-      </w:pPr>
-      <w:r>
-        <w:t>Lab 4: Five slides; Q3 revenue S$378k and net S$108.5k match Excel</w:t>
-      </w:r>
-    </w:p>
-    <w:p>
-      <w:pPr>
-        <w:pStyle w:val="ListBullet"/>
-      </w:pPr>
-      <w:r>
-        <w:t>Lab 5: Five rows; duplicate INV-204 and missing PO are visible</w:t>
-      </w:r>
-    </w:p>
-    <w:p>
-      <w:pPr>
-        <w:pStyle w:val="ListBullet"/>
-      </w:pPr>
-      <w:r>
-        <w:t>Lab 6: Each comment links to a line item or is marked as a question</w:t>
-      </w:r>
-    </w:p>
-    <w:p>
-      <w:pPr>
-        <w:pStyle w:val="ListBullet"/>
-      </w:pPr>
-      <w:r>
-        <w:t>Lab 7: Low-balance day and top payments match the workbook</w:t>
-      </w:r>
-    </w:p>
-    <w:p>
-      <w:pPr>
-        <w:pStyle w:val="ListBullet"/>
-      </w:pPr>
-      <w:r>
-        <w:t>Lab 8: Draft stays on demand; unapproved workbook is rejected</w:t>
-      </w:r>
-    </w:p>
     <w:sectPr>
+      <w:footerReference w:type="default" r:id="rId10"/>
       <w:pgSz w:w="12240" w:h="15840"/>
       <w:pgMar w:top="1440" w:right="1800" w:bottom="1440" w:left="1800" w:header="720" w:footer="720" w:gutter="0"/>
       <w:cols w:space="720"/>
@@ -799,6 +2094,64 @@
     </w:sectPr>
   </w:body>
 </w:document>
+</file>
+
+<file path=word/footer1.xml><?xml version="1.0" encoding="utf-8"?>
+<w:ftr xmlns:m="http://schemas.openxmlformats.org/officeDocument/2006/math" xmlns:mc="http://schemas.openxmlformats.org/markup-compatibility/2006" xmlns:mo="http://schemas.microsoft.com/office/mac/office/2008/main" xmlns:mv="urn:schemas-microsoft-com:mac:vml" xmlns:o="urn:schemas-microsoft-com:office:office" xmlns:r="http://schemas.openxmlformats.org/officeDocument/2006/relationships" xmlns:v="urn:schemas-microsoft-com:vml" xmlns:w10="urn:schemas-microsoft-com:office:word" xmlns:w14="http://schemas.microsoft.com/office/word/2010/wordml" xmlns:w="http://schemas.openxmlformats.org/wordprocessingml/2006/main" xmlns:wne="http://schemas.microsoft.com/office/word/2006/wordml" xmlns:wp14="http://schemas.microsoft.com/office/word/2010/wordprocessingDrawing" xmlns:wp="http://schemas.openxmlformats.org/drawingml/2006/wordprocessingDrawing" xmlns:wpc="http://schemas.microsoft.com/office/word/2010/wordprocessingCanvas" xmlns:wpg="http://schemas.microsoft.com/office/word/2010/wordprocessingGroup" xmlns:wpi="http://schemas.microsoft.com/office/word/2010/wordprocessingInk" xmlns:wps="http://schemas.microsoft.com/office/word/2010/wordprocessingShape" mc:Ignorable="w14 wp14">
+  <w:p>
+    <w:pPr>
+      <w:pStyle w:val="Footer"/>
+      <w:jc w:val="center"/>
+    </w:pPr>
+    <w:r/>
+    <w:r>
+      <w:rPr>
+        <w:color w:val="555B66"/>
+        <w:sz w:val="18"/>
+      </w:rPr>
+      <w:t xml:space="preserve">Page </w:t>
+    </w:r>
+    <w:r>
+      <w:rPr>
+        <w:sz w:val="18"/>
+      </w:rPr>
+      <w:fldChar w:fldCharType="begin"/>
+      <w:instrText xml:space="preserve">PAGE</w:instrText>
+      <w:fldChar w:fldCharType="separate"/>
+      <w:t>1</w:t>
+      <w:fldChar w:fldCharType="end"/>
+    </w:r>
+    <w:r>
+      <w:rPr>
+        <w:color w:val="555B66"/>
+        <w:sz w:val="18"/>
+      </w:rPr>
+      <w:t xml:space="preserve"> of </w:t>
+    </w:r>
+    <w:r>
+      <w:rPr>
+        <w:sz w:val="18"/>
+      </w:rPr>
+      <w:fldChar w:fldCharType="begin"/>
+      <w:instrText xml:space="preserve">NUMPAGES</w:instrText>
+      <w:fldChar w:fldCharType="separate"/>
+      <w:t>1</w:t>
+      <w:fldChar w:fldCharType="end"/>
+    </w:r>
+  </w:p>
+  <w:p>
+    <w:pPr>
+      <w:jc w:val="center"/>
+    </w:pPr>
+    <w:r>
+      <w:rPr>
+        <w:color w:val="555B66"/>
+        <w:sz w:val="15"/>
+      </w:rPr>
+      <w:t>© 2026 Tertiary Infotech Academy Pte Ltd. All rights reserved.  ·  www.tertiarycourses.com.sg</w:t>
+    </w:r>
+  </w:p>
+</w:ftr>
 </file>
 
 <file path=word/numbering.xml><?xml version="1.0" encoding="utf-8"?>
@@ -1164,6 +2517,10 @@
     <w:name w:val="Normal"/>
     <w:qFormat/>
     <w:rsid w:val="00FC693F"/>
+    <w:rPr>
+      <w:rFonts w:ascii="Arial" w:hAnsi="Arial"/>
+      <w:sz w:val="22"/>
+    </w:rPr>
   </w:style>
   <w:style w:type="paragraph" w:styleId="Header">
     <w:name w:val="header"/>
@@ -1224,11 +2581,11 @@
       <w:outlineLvl w:val="0"/>
     </w:pPr>
     <w:rPr>
-      <w:rFonts w:asciiTheme="majorHAnsi" w:eastAsiaTheme="majorEastAsia" w:hAnsiTheme="majorHAnsi" w:cstheme="majorBidi"/>
+      <w:rFonts w:asciiTheme="majorHAnsi" w:eastAsiaTheme="majorEastAsia" w:hAnsiTheme="majorHAnsi" w:cstheme="majorBidi" w:ascii="Arial" w:hAnsi="Arial"/>
       <w:b/>
       <w:bCs/>
-      <w:color w:val="365F91" w:themeColor="accent1" w:themeShade="BF"/>
-      <w:sz w:val="28"/>
+      <w:color w:val="1F6FEB"/>
+      <w:sz w:val="32"/>
       <w:szCs w:val="28"/>
     </w:rPr>
   </w:style>
@@ -1248,10 +2605,10 @@
       <w:outlineLvl w:val="1"/>
     </w:pPr>
     <w:rPr>
-      <w:rFonts w:asciiTheme="majorHAnsi" w:eastAsiaTheme="majorEastAsia" w:hAnsiTheme="majorHAnsi" w:cstheme="majorBidi"/>
+      <w:rFonts w:asciiTheme="majorHAnsi" w:eastAsiaTheme="majorEastAsia" w:hAnsiTheme="majorHAnsi" w:cstheme="majorBidi" w:ascii="Arial" w:hAnsi="Arial"/>
       <w:b/>
       <w:bCs/>
-      <w:color w:val="4F81BD" w:themeColor="accent1"/>
+      <w:color w:val="111827"/>
       <w:sz w:val="26"/>
       <w:szCs w:val="26"/>
     </w:rPr>
@@ -1272,10 +2629,11 @@
       <w:outlineLvl w:val="2"/>
     </w:pPr>
     <w:rPr>
-      <w:rFonts w:asciiTheme="majorHAnsi" w:eastAsiaTheme="majorEastAsia" w:hAnsiTheme="majorHAnsi" w:cstheme="majorBidi"/>
+      <w:rFonts w:asciiTheme="majorHAnsi" w:eastAsiaTheme="majorEastAsia" w:hAnsiTheme="majorHAnsi" w:cstheme="majorBidi" w:ascii="Arial" w:hAnsi="Arial"/>
       <w:b/>
       <w:bCs/>
-      <w:color w:val="4F81BD" w:themeColor="accent1"/>
+      <w:color w:val="1F6FEB"/>
+      <w:sz w:val="22"/>
     </w:rPr>
   </w:style>
   <w:style w:type="paragraph" w:styleId="Heading4">
@@ -1513,11 +2871,12 @@
       <w:contextualSpacing/>
     </w:pPr>
     <w:rPr>
-      <w:rFonts w:asciiTheme="majorHAnsi" w:eastAsiaTheme="majorEastAsia" w:hAnsiTheme="majorHAnsi" w:cstheme="majorBidi"/>
-      <w:color w:val="17365D" w:themeColor="text2" w:themeShade="BF"/>
+      <w:rFonts w:asciiTheme="majorHAnsi" w:eastAsiaTheme="majorEastAsia" w:hAnsiTheme="majorHAnsi" w:cstheme="majorBidi" w:ascii="Arial" w:hAnsi="Arial"/>
+      <w:b/>
+      <w:color w:val="111827"/>
       <w:spacing w:val="5"/>
       <w:kern w:val="28"/>
-      <w:sz w:val="52"/>
+      <w:sz w:val="48"/>
       <w:szCs w:val="52"/>
     </w:rPr>
   </w:style>

</xml_diff>